<commit_message>
Actividades 2.2 y 2.3: ajustes de la revisión del 24 de octubre
Desglose de los traslados (H29) y de los derivados no agregados (D39) en el reporte 11, con tres comprobaciones independientes nuevas (77, sin fallas); intercepto de calibración con offset (D43); marca de ventana cortada como variable y sensibilidad con 2020 y 2022 (D44); estados de D38 a D42. Datos y partición sin cambios (versión 2).
</commit_message>
<xml_diff>
--- a/2.2_depuracion_etiquetado/bitacora.docx
+++ b/2.2_depuracion_etiquetado/bitacora.docx
@@ -38,7 +38,7 @@
           <w:sz w:val="18"/>
           <w:szCs w:val="18"/>
         </w:rPr>
-        <w:t xml:space="preserve">Actualizada al 20 de octubre de 2026 · Versión Word generada a partir de Codigo/2.2_depuracion_etiquetado/bitacora.md</w:t>
+        <w:t xml:space="preserve">Actualizada al 26 de octubre de 2026 · Versión Word generada a partir de Codigo/2.2_depuracion_etiquetado/bitacora.md</w:t>
       </w:r>
     </w:p>
     <w:p>
@@ -262,7 +262,55 @@
         </w:r>
       </w:hyperlink>
       <w:r>
-        <w:t xml:space="preserve"> responde a otro punto de la misma revisión (2.3), sobre la calidad del identificador por año. Cada exclusión se puede activar o desactivar en </w:t>
+        <w:t xml:space="preserve"> responde a otro punto de la misma revisión (2.3), sobre la calidad del identificador por año. En su revisión del 24 de octubre dio por subsanados esos puntos y aprobó </w:t>
+      </w:r>
+      <w:hyperlink w:history="1" w:anchor="E_D38">
+        <w:r>
+          <w:rPr>
+            <w:color w:val="0563C1"/>
+            <w:u w:val="single"/>
+          </w:rPr>
+          <w:t xml:space="preserve">D38</w:t>
+        </w:r>
+      </w:hyperlink>
+      <w:r>
+        <w:t xml:space="preserve"> y </w:t>
+      </w:r>
+      <w:hyperlink w:history="1" w:anchor="E_D39">
+        <w:r>
+          <w:rPr>
+            <w:color w:val="0563C1"/>
+            <w:u w:val="single"/>
+          </w:rPr>
+          <w:t xml:space="preserve">D39</w:t>
+        </w:r>
+      </w:hyperlink>
+      <w:r>
+        <w:t xml:space="preserve">; pidió explicar dos cifras de la sensibilidad, que se agregaron el 26 de octubre: por qué exigir la marca de traslado suma menos reingresos que episodios separa (observación O3, </w:t>
+      </w:r>
+      <w:hyperlink w:history="1" w:anchor="E_H29">
+        <w:r>
+          <w:rPr>
+            <w:color w:val="0563C1"/>
+            <w:u w:val="single"/>
+          </w:rPr>
+          <w:t xml:space="preserve">H29</w:t>
+        </w:r>
+      </w:hyperlink>
+      <w:r>
+        <w:t xml:space="preserve">) y qué criterio deja fuera a los derivados que la fila de sensibilidad no agrega (observación O4, </w:t>
+      </w:r>
+      <w:hyperlink w:history="1" w:anchor="E_D39">
+        <w:r>
+          <w:rPr>
+            <w:color w:val="0563C1"/>
+            <w:u w:val="single"/>
+          </w:rPr>
+          <w:t xml:space="preserve">D39</w:t>
+        </w:r>
+      </w:hyperlink>
+      <w:r>
+        <w:t xml:space="preserve">). Cada exclusión se puede activar o desactivar en </w:t>
       </w:r>
       <w:r>
         <w:rPr>
@@ -26252,7 +26300,7 @@
                 <w:sz w:val="20"/>
                 <w:szCs w:val="20"/>
               </w:rPr>
-              <w:t xml:space="preserve">). Los catorce criterios no cambiaron.</w:t>
+              <w:t xml:space="preserve">). Los catorce criterios no cambiaron. En su revisión del 24 de octubre de 2026 dio por subsanados los dos puntos.</w:t>
             </w:r>
           </w:p>
         </w:tc>
@@ -28490,7 +28538,7 @@
                 <w:sz w:val="20"/>
                 <w:szCs w:val="20"/>
               </w:rPr>
-              <w:t xml:space="preserve">Adoptada, por recomendación del profesor guía.</w:t>
+              <w:t xml:space="preserve">Adoptada, por recomendación del profesor guía. Aprobada por el profesor guía el 24 de octubre de 2026, con la unión de las CDM 13 y 14 como sensibilidad: considera completa la verificación de la CDM 14 y correcta la decisión.</w:t>
             </w:r>
           </w:p>
         </w:tc>
@@ -30714,6 +30762,108 @@
           </w:tcPr>
           <w:p>
             <w:pPr>
+              <w:keepNext/>
+              <w:spacing w:after="0"/>
+            </w:pPr>
+            <w:r>
+              <w:rPr>
+                <w:b/>
+                <w:bCs/>
+                <w:color w:val="404040"/>
+                <w:sz w:val="20"/>
+                <w:szCs w:val="20"/>
+              </w:rPr>
+              <w:t xml:space="preserve">Completada por</w:t>
+            </w:r>
+          </w:p>
+        </w:tc>
+        <w:tc>
+          <w:tcPr>
+            <w:tcW w:type="dxa" w:w="7226"/>
+            <w:tcMar>
+              <w:top w:type="dxa" w:w="70"/>
+              <w:left w:type="dxa" w:w="100"/>
+              <w:bottom w:type="dxa" w:w="70"/>
+              <w:right w:type="dxa" w:w="100"/>
+            </w:tcMar>
+          </w:tcPr>
+          <w:p>
+            <w:pPr>
+              <w:keepNext/>
+              <w:spacing w:after="0" w:before="0"/>
+            </w:pPr>
+            <w:hyperlink w:history="1" w:anchor="E_H29">
+              <w:r>
+                <w:rPr>
+                  <w:color w:val="0563C1"/>
+                  <w:sz w:val="20"/>
+                  <w:szCs w:val="20"/>
+                  <w:u w:val="single"/>
+                </w:rPr>
+                <w:t xml:space="preserve">H29</w:t>
+              </w:r>
+            </w:hyperlink>
+            <w:r>
+              <w:rPr>
+                <w:sz w:val="20"/>
+                <w:szCs w:val="20"/>
+              </w:rPr>
+              <w:t xml:space="preserve"> (26 de octubre de 2026), que explica por qué los 3.755 episodios separados suman 2.133 casos con </w:t>
+            </w:r>
+            <w:r>
+              <w:rPr>
+                <w:rFonts w:ascii="Consolas" w:cs="Consolas" w:eastAsia="Consolas" w:hAnsi="Consolas"/>
+                <w:sz w:val="18"/>
+                <w:szCs w:val="18"/>
+                <w:shd w:fill="F2F2F2" w:color="auto" w:val="clear"/>
+              </w:rPr>
+              <w:t xml:space="preserve">REING_7D</w:t>
+            </w:r>
+            <w:r>
+              <w:rPr>
+                <w:sz w:val="20"/>
+                <w:szCs w:val="20"/>
+              </w:rPr>
+              <w:t xml:space="preserve">, y </w:t>
+            </w:r>
+            <w:hyperlink w:history="1" w:anchor="E_D39">
+              <w:r>
+                <w:rPr>
+                  <w:color w:val="0563C1"/>
+                  <w:sz w:val="20"/>
+                  <w:szCs w:val="20"/>
+                  <w:u w:val="single"/>
+                </w:rPr>
+                <w:t xml:space="preserve">D39</w:t>
+              </w:r>
+            </w:hyperlink>
+            <w:r>
+              <w:rPr>
+                <w:sz w:val="20"/>
+                <w:szCs w:val="20"/>
+              </w:rPr>
+              <w:t xml:space="preserve">, con los derivados que la fila de sensibilidad no agrega.</w:t>
+            </w:r>
+          </w:p>
+        </w:tc>
+      </w:tr>
+      <w:tr>
+        <w:trPr>
+          <w:cantSplit/>
+        </w:trPr>
+        <w:tc>
+          <w:tcPr>
+            <w:tcW w:type="dxa" w:w="1800"/>
+            <w:shd w:fill="F2F2F2" w:color="auto" w:val="clear"/>
+            <w:tcMar>
+              <w:top w:type="dxa" w:w="70"/>
+              <w:left w:type="dxa" w:w="100"/>
+              <w:bottom w:type="dxa" w:w="70"/>
+              <w:right w:type="dxa" w:w="100"/>
+            </w:tcMar>
+          </w:tcPr>
+          <w:p>
+            <w:pPr>
               <w:keepNext w:val="false"/>
               <w:spacing w:after="0"/>
             </w:pPr>
@@ -31147,6 +31297,865 @@
                 <w:sz w:val="20"/>
                 <w:szCs w:val="20"/>
               </w:rPr>
+              <w:t xml:space="preserve"/>
+            </w:r>
+          </w:p>
+        </w:tc>
+        <w:tc>
+          <w:tcPr>
+            <w:tcW w:type="dxa" w:w="7226"/>
+            <w:tcMar>
+              <w:top w:type="dxa" w:w="70"/>
+              <w:left w:type="dxa" w:w="100"/>
+              <w:bottom w:type="dxa" w:w="70"/>
+              <w:right w:type="dxa" w:w="100"/>
+            </w:tcMar>
+          </w:tcPr>
+          <w:p>
+            <w:pPr>
+              <w:keepNext/>
+              <w:spacing w:after="80" w:before="0"/>
+            </w:pPr>
+            <w:r>
+              <w:rPr>
+                <w:b/>
+                <w:bCs/>
+                <w:sz w:val="20"/>
+                <w:szCs w:val="20"/>
+              </w:rPr>
+              <w:t xml:space="preserve">Derivados que no se agregan</w:t>
+            </w:r>
+            <w:r>
+              <w:rPr>
+                <w:sz w:val="20"/>
+                <w:szCs w:val="20"/>
+              </w:rPr>
+              <w:t xml:space="preserve"> (agregado el 26 de octubre de 2026, observación O4 de la revisión del 24 de octubre): De los 99.573 derivados, 5.784 no se agregan, porque al desactivar E07 y E08 cada derivado pasa al siguiente criterio de la tabla y estos cumplen alguno:</w:t>
+            </w:r>
+          </w:p>
+          <w:tbl>
+            <w:tblPr>
+              <w:tblW w:type="dxa" w:w="7026"/>
+              <w:tblBorders>
+                <w:top w:val="single" w:color="BFBFBF" w:sz="4"/>
+                <w:left w:val="single" w:color="BFBFBF" w:sz="4"/>
+                <w:bottom w:val="single" w:color="BFBFBF" w:sz="4"/>
+                <w:right w:val="single" w:color="BFBFBF" w:sz="4"/>
+                <w:insideH w:val="single" w:color="BFBFBF" w:sz="4"/>
+                <w:insideV w:val="single" w:color="BFBFBF" w:sz="4"/>
+              </w:tblBorders>
+              <w:tblLayout w:type="fixed"/>
+            </w:tblPr>
+            <w:tblGrid>
+              <w:gridCol w:w="4326"/>
+              <w:gridCol w:w="899"/>
+              <w:gridCol w:w="899"/>
+              <w:gridCol w:w="902"/>
+            </w:tblGrid>
+            <w:tr>
+              <w:trPr>
+                <w:cantSplit/>
+                <w:tblHeader/>
+              </w:trPr>
+              <w:tc>
+                <w:tcPr>
+                  <w:tcW w:type="dxa" w:w="4326"/>
+                  <w:shd w:fill="D9E2F3" w:color="auto" w:val="clear"/>
+                  <w:tcMar>
+                    <w:top w:type="dxa" w:w="70"/>
+                    <w:left w:type="dxa" w:w="100"/>
+                    <w:bottom w:type="dxa" w:w="70"/>
+                    <w:right w:type="dxa" w:w="100"/>
+                  </w:tcMar>
+                  <w:vAlign w:val="center"/>
+                </w:tcPr>
+                <w:p>
+                  <w:pPr>
+                    <w:spacing w:after="0"/>
+                  </w:pPr>
+                  <w:r>
+                    <w:rPr>
+                      <w:b/>
+                      <w:bCs/>
+                      <w:sz w:val="18"/>
+                      <w:szCs w:val="18"/>
+                    </w:rPr>
+                    <w:t xml:space="preserve">Criterio que los deja fuera</w:t>
+                  </w:r>
+                </w:p>
+              </w:tc>
+              <w:tc>
+                <w:tcPr>
+                  <w:tcW w:type="dxa" w:w="899"/>
+                  <w:shd w:fill="D9E2F3" w:color="auto" w:val="clear"/>
+                  <w:tcMar>
+                    <w:top w:type="dxa" w:w="70"/>
+                    <w:left w:type="dxa" w:w="100"/>
+                    <w:bottom w:type="dxa" w:w="70"/>
+                    <w:right w:type="dxa" w:w="100"/>
+                  </w:tcMar>
+                  <w:vAlign w:val="center"/>
+                </w:tcPr>
+                <w:p>
+                  <w:pPr>
+                    <w:spacing w:after="0"/>
+                  </w:pPr>
+                  <w:r>
+                    <w:rPr>
+                      <w:b/>
+                      <w:bCs/>
+                      <w:sz w:val="18"/>
+                      <w:szCs w:val="18"/>
+                    </w:rPr>
+                    <w:t xml:space="preserve">E07</w:t>
+                  </w:r>
+                </w:p>
+              </w:tc>
+              <w:tc>
+                <w:tcPr>
+                  <w:tcW w:type="dxa" w:w="899"/>
+                  <w:shd w:fill="D9E2F3" w:color="auto" w:val="clear"/>
+                  <w:tcMar>
+                    <w:top w:type="dxa" w:w="70"/>
+                    <w:left w:type="dxa" w:w="100"/>
+                    <w:bottom w:type="dxa" w:w="70"/>
+                    <w:right w:type="dxa" w:w="100"/>
+                  </w:tcMar>
+                  <w:vAlign w:val="center"/>
+                </w:tcPr>
+                <w:p>
+                  <w:pPr>
+                    <w:spacing w:after="0"/>
+                  </w:pPr>
+                  <w:r>
+                    <w:rPr>
+                      <w:b/>
+                      <w:bCs/>
+                      <w:sz w:val="18"/>
+                      <w:szCs w:val="18"/>
+                    </w:rPr>
+                    <w:t xml:space="preserve">E08</w:t>
+                  </w:r>
+                </w:p>
+              </w:tc>
+              <w:tc>
+                <w:tcPr>
+                  <w:tcW w:type="dxa" w:w="902"/>
+                  <w:shd w:fill="D9E2F3" w:color="auto" w:val="clear"/>
+                  <w:tcMar>
+                    <w:top w:type="dxa" w:w="70"/>
+                    <w:left w:type="dxa" w:w="100"/>
+                    <w:bottom w:type="dxa" w:w="70"/>
+                    <w:right w:type="dxa" w:w="100"/>
+                  </w:tcMar>
+                  <w:vAlign w:val="center"/>
+                </w:tcPr>
+                <w:p>
+                  <w:pPr>
+                    <w:spacing w:after="0"/>
+                  </w:pPr>
+                  <w:r>
+                    <w:rPr>
+                      <w:b/>
+                      <w:bCs/>
+                      <w:sz w:val="18"/>
+                      <w:szCs w:val="18"/>
+                    </w:rPr>
+                    <w:t xml:space="preserve">Total</w:t>
+                  </w:r>
+                </w:p>
+              </w:tc>
+            </w:tr>
+            <w:tr>
+              <w:trPr>
+                <w:cantSplit/>
+                <w:tblHeader w:val="off"/>
+              </w:trPr>
+              <w:tc>
+                <w:tcPr>
+                  <w:tcW w:type="dxa" w:w="4326"/>
+                  <w:tcMar>
+                    <w:top w:type="dxa" w:w="70"/>
+                    <w:left w:type="dxa" w:w="100"/>
+                    <w:bottom w:type="dxa" w:w="70"/>
+                    <w:right w:type="dxa" w:w="100"/>
+                  </w:tcMar>
+                  <w:vAlign w:val="center"/>
+                </w:tcPr>
+                <w:p>
+                  <w:pPr>
+                    <w:spacing w:after="0"/>
+                  </w:pPr>
+                  <w:r>
+                    <w:rPr>
+                      <w:sz w:val="18"/>
+                      <w:szCs w:val="18"/>
+                    </w:rPr>
+                    <w:t xml:space="preserve">E11, seguimiento incompleto: alta a menos de 37 días del cierre del bloque (1.865 en 2020 y 2.366 en 2024)</w:t>
+                  </w:r>
+                </w:p>
+              </w:tc>
+              <w:tc>
+                <w:tcPr>
+                  <w:tcW w:type="dxa" w:w="899"/>
+                  <w:tcMar>
+                    <w:top w:type="dxa" w:w="70"/>
+                    <w:left w:type="dxa" w:w="100"/>
+                    <w:bottom w:type="dxa" w:w="70"/>
+                    <w:right w:type="dxa" w:w="100"/>
+                  </w:tcMar>
+                  <w:vAlign w:val="center"/>
+                </w:tcPr>
+                <w:p>
+                  <w:pPr>
+                    <w:spacing w:after="0"/>
+                  </w:pPr>
+                  <w:r>
+                    <w:rPr>
+                      <w:sz w:val="18"/>
+                      <w:szCs w:val="18"/>
+                    </w:rPr>
+                    <w:t xml:space="preserve">3.505</w:t>
+                  </w:r>
+                </w:p>
+              </w:tc>
+              <w:tc>
+                <w:tcPr>
+                  <w:tcW w:type="dxa" w:w="899"/>
+                  <w:tcMar>
+                    <w:top w:type="dxa" w:w="70"/>
+                    <w:left w:type="dxa" w:w="100"/>
+                    <w:bottom w:type="dxa" w:w="70"/>
+                    <w:right w:type="dxa" w:w="100"/>
+                  </w:tcMar>
+                  <w:vAlign w:val="center"/>
+                </w:tcPr>
+                <w:p>
+                  <w:pPr>
+                    <w:spacing w:after="0"/>
+                  </w:pPr>
+                  <w:r>
+                    <w:rPr>
+                      <w:sz w:val="18"/>
+                      <w:szCs w:val="18"/>
+                    </w:rPr>
+                    <w:t xml:space="preserve">726</w:t>
+                  </w:r>
+                </w:p>
+              </w:tc>
+              <w:tc>
+                <w:tcPr>
+                  <w:tcW w:type="dxa" w:w="902"/>
+                  <w:tcMar>
+                    <w:top w:type="dxa" w:w="70"/>
+                    <w:left w:type="dxa" w:w="100"/>
+                    <w:bottom w:type="dxa" w:w="70"/>
+                    <w:right w:type="dxa" w:w="100"/>
+                  </w:tcMar>
+                  <w:vAlign w:val="center"/>
+                </w:tcPr>
+                <w:p>
+                  <w:pPr>
+                    <w:spacing w:after="0"/>
+                  </w:pPr>
+                  <w:r>
+                    <w:rPr>
+                      <w:sz w:val="18"/>
+                      <w:szCs w:val="18"/>
+                    </w:rPr>
+                    <w:t xml:space="preserve">4.231</w:t>
+                  </w:r>
+                </w:p>
+              </w:tc>
+            </w:tr>
+            <w:tr>
+              <w:trPr>
+                <w:cantSplit/>
+                <w:tblHeader w:val="off"/>
+              </w:trPr>
+              <w:tc>
+                <w:tcPr>
+                  <w:tcW w:type="dxa" w:w="4326"/>
+                  <w:tcMar>
+                    <w:top w:type="dxa" w:w="70"/>
+                    <w:left w:type="dxa" w:w="100"/>
+                    <w:bottom w:type="dxa" w:w="70"/>
+                    <w:right w:type="dxa" w:w="100"/>
+                  </w:tcMar>
+                  <w:vAlign w:val="center"/>
+                </w:tcPr>
+                <w:p>
+                  <w:pPr>
+                    <w:spacing w:after="0"/>
+                  </w:pPr>
+                  <w:r>
+                    <w:rPr>
+                      <w:sz w:val="18"/>
+                      <w:szCs w:val="18"/>
+                    </w:rPr>
+                    <w:t xml:space="preserve">E13, cirugía mayor ambulatoria</w:t>
+                  </w:r>
+                </w:p>
+              </w:tc>
+              <w:tc>
+                <w:tcPr>
+                  <w:tcW w:type="dxa" w:w="899"/>
+                  <w:tcMar>
+                    <w:top w:type="dxa" w:w="70"/>
+                    <w:left w:type="dxa" w:w="100"/>
+                    <w:bottom w:type="dxa" w:w="70"/>
+                    <w:right w:type="dxa" w:w="100"/>
+                  </w:tcMar>
+                  <w:vAlign w:val="center"/>
+                </w:tcPr>
+                <w:p>
+                  <w:pPr>
+                    <w:spacing w:after="0"/>
+                  </w:pPr>
+                  <w:r>
+                    <w:rPr>
+                      <w:sz w:val="18"/>
+                      <w:szCs w:val="18"/>
+                    </w:rPr>
+                    <w:t xml:space="preserve">1.087</w:t>
+                  </w:r>
+                </w:p>
+              </w:tc>
+              <w:tc>
+                <w:tcPr>
+                  <w:tcW w:type="dxa" w:w="899"/>
+                  <w:tcMar>
+                    <w:top w:type="dxa" w:w="70"/>
+                    <w:left w:type="dxa" w:w="100"/>
+                    <w:bottom w:type="dxa" w:w="70"/>
+                    <w:right w:type="dxa" w:w="100"/>
+                  </w:tcMar>
+                  <w:vAlign w:val="center"/>
+                </w:tcPr>
+                <w:p>
+                  <w:pPr>
+                    <w:spacing w:after="0"/>
+                  </w:pPr>
+                  <w:r>
+                    <w:rPr>
+                      <w:sz w:val="18"/>
+                      <w:szCs w:val="18"/>
+                    </w:rPr>
+                    <w:t xml:space="preserve">194</w:t>
+                  </w:r>
+                </w:p>
+              </w:tc>
+              <w:tc>
+                <w:tcPr>
+                  <w:tcW w:type="dxa" w:w="902"/>
+                  <w:tcMar>
+                    <w:top w:type="dxa" w:w="70"/>
+                    <w:left w:type="dxa" w:w="100"/>
+                    <w:bottom w:type="dxa" w:w="70"/>
+                    <w:right w:type="dxa" w:w="100"/>
+                  </w:tcMar>
+                  <w:vAlign w:val="center"/>
+                </w:tcPr>
+                <w:p>
+                  <w:pPr>
+                    <w:spacing w:after="0"/>
+                  </w:pPr>
+                  <w:r>
+                    <w:rPr>
+                      <w:sz w:val="18"/>
+                      <w:szCs w:val="18"/>
+                    </w:rPr>
+                    <w:t xml:space="preserve">1.281</w:t>
+                  </w:r>
+                </w:p>
+              </w:tc>
+            </w:tr>
+            <w:tr>
+              <w:trPr>
+                <w:cantSplit/>
+                <w:tblHeader w:val="off"/>
+              </w:trPr>
+              <w:tc>
+                <w:tcPr>
+                  <w:tcW w:type="dxa" w:w="4326"/>
+                  <w:tcMar>
+                    <w:top w:type="dxa" w:w="70"/>
+                    <w:left w:type="dxa" w:w="100"/>
+                    <w:bottom w:type="dxa" w:w="70"/>
+                    <w:right w:type="dxa" w:w="100"/>
+                  </w:tcMar>
+                  <w:vAlign w:val="center"/>
+                </w:tcPr>
+                <w:p>
+                  <w:pPr>
+                    <w:spacing w:after="0"/>
+                  </w:pPr>
+                  <w:r>
+                    <w:rPr>
+                      <w:sz w:val="18"/>
+                      <w:szCs w:val="18"/>
+                    </w:rPr>
+                    <w:t xml:space="preserve">E14, sesión de tratamiento (Z51)</w:t>
+                  </w:r>
+                </w:p>
+              </w:tc>
+              <w:tc>
+                <w:tcPr>
+                  <w:tcW w:type="dxa" w:w="899"/>
+                  <w:tcMar>
+                    <w:top w:type="dxa" w:w="70"/>
+                    <w:left w:type="dxa" w:w="100"/>
+                    <w:bottom w:type="dxa" w:w="70"/>
+                    <w:right w:type="dxa" w:w="100"/>
+                  </w:tcMar>
+                  <w:vAlign w:val="center"/>
+                </w:tcPr>
+                <w:p>
+                  <w:pPr>
+                    <w:spacing w:after="0"/>
+                  </w:pPr>
+                  <w:r>
+                    <w:rPr>
+                      <w:sz w:val="18"/>
+                      <w:szCs w:val="18"/>
+                    </w:rPr>
+                    <w:t xml:space="preserve">153</w:t>
+                  </w:r>
+                </w:p>
+              </w:tc>
+              <w:tc>
+                <w:tcPr>
+                  <w:tcW w:type="dxa" w:w="899"/>
+                  <w:tcMar>
+                    <w:top w:type="dxa" w:w="70"/>
+                    <w:left w:type="dxa" w:w="100"/>
+                    <w:bottom w:type="dxa" w:w="70"/>
+                    <w:right w:type="dxa" w:w="100"/>
+                  </w:tcMar>
+                  <w:vAlign w:val="center"/>
+                </w:tcPr>
+                <w:p>
+                  <w:pPr>
+                    <w:spacing w:after="0"/>
+                  </w:pPr>
+                  <w:r>
+                    <w:rPr>
+                      <w:sz w:val="18"/>
+                      <w:szCs w:val="18"/>
+                    </w:rPr>
+                    <w:t xml:space="preserve">52</w:t>
+                  </w:r>
+                </w:p>
+              </w:tc>
+              <w:tc>
+                <w:tcPr>
+                  <w:tcW w:type="dxa" w:w="902"/>
+                  <w:tcMar>
+                    <w:top w:type="dxa" w:w="70"/>
+                    <w:left w:type="dxa" w:w="100"/>
+                    <w:bottom w:type="dxa" w:w="70"/>
+                    <w:right w:type="dxa" w:w="100"/>
+                  </w:tcMar>
+                  <w:vAlign w:val="center"/>
+                </w:tcPr>
+                <w:p>
+                  <w:pPr>
+                    <w:spacing w:after="0"/>
+                  </w:pPr>
+                  <w:r>
+                    <w:rPr>
+                      <w:sz w:val="18"/>
+                      <w:szCs w:val="18"/>
+                    </w:rPr>
+                    <w:t xml:space="preserve">205</w:t>
+                  </w:r>
+                </w:p>
+              </w:tc>
+            </w:tr>
+            <w:tr>
+              <w:trPr>
+                <w:cantSplit/>
+                <w:tblHeader w:val="off"/>
+              </w:trPr>
+              <w:tc>
+                <w:tcPr>
+                  <w:tcW w:type="dxa" w:w="4326"/>
+                  <w:tcMar>
+                    <w:top w:type="dxa" w:w="70"/>
+                    <w:left w:type="dxa" w:w="100"/>
+                    <w:bottom w:type="dxa" w:w="70"/>
+                    <w:right w:type="dxa" w:w="100"/>
+                  </w:tcMar>
+                  <w:vAlign w:val="center"/>
+                </w:tcPr>
+                <w:p>
+                  <w:pPr>
+                    <w:spacing w:after="0"/>
+                  </w:pPr>
+                  <w:r>
+                    <w:rPr>
+                      <w:sz w:val="18"/>
+                      <w:szCs w:val="18"/>
+                    </w:rPr>
+                    <w:t xml:space="preserve">E09, sin GRD válido</w:t>
+                  </w:r>
+                </w:p>
+              </w:tc>
+              <w:tc>
+                <w:tcPr>
+                  <w:tcW w:type="dxa" w:w="899"/>
+                  <w:tcMar>
+                    <w:top w:type="dxa" w:w="70"/>
+                    <w:left w:type="dxa" w:w="100"/>
+                    <w:bottom w:type="dxa" w:w="70"/>
+                    <w:right w:type="dxa" w:w="100"/>
+                  </w:tcMar>
+                  <w:vAlign w:val="center"/>
+                </w:tcPr>
+                <w:p>
+                  <w:pPr>
+                    <w:spacing w:after="0"/>
+                  </w:pPr>
+                  <w:r>
+                    <w:rPr>
+                      <w:sz w:val="18"/>
+                      <w:szCs w:val="18"/>
+                    </w:rPr>
+                    <w:t xml:space="preserve">52</w:t>
+                  </w:r>
+                </w:p>
+              </w:tc>
+              <w:tc>
+                <w:tcPr>
+                  <w:tcW w:type="dxa" w:w="899"/>
+                  <w:tcMar>
+                    <w:top w:type="dxa" w:w="70"/>
+                    <w:left w:type="dxa" w:w="100"/>
+                    <w:bottom w:type="dxa" w:w="70"/>
+                    <w:right w:type="dxa" w:w="100"/>
+                  </w:tcMar>
+                  <w:vAlign w:val="center"/>
+                </w:tcPr>
+                <w:p>
+                  <w:pPr>
+                    <w:spacing w:after="0"/>
+                  </w:pPr>
+                  <w:r>
+                    <w:rPr>
+                      <w:sz w:val="18"/>
+                      <w:szCs w:val="18"/>
+                    </w:rPr>
+                    <w:t xml:space="preserve">15</w:t>
+                  </w:r>
+                </w:p>
+              </w:tc>
+              <w:tc>
+                <w:tcPr>
+                  <w:tcW w:type="dxa" w:w="902"/>
+                  <w:tcMar>
+                    <w:top w:type="dxa" w:w="70"/>
+                    <w:left w:type="dxa" w:w="100"/>
+                    <w:bottom w:type="dxa" w:w="70"/>
+                    <w:right w:type="dxa" w:w="100"/>
+                  </w:tcMar>
+                  <w:vAlign w:val="center"/>
+                </w:tcPr>
+                <w:p>
+                  <w:pPr>
+                    <w:spacing w:after="0"/>
+                  </w:pPr>
+                  <w:r>
+                    <w:rPr>
+                      <w:sz w:val="18"/>
+                      <w:szCs w:val="18"/>
+                    </w:rPr>
+                    <w:t xml:space="preserve">67</w:t>
+                  </w:r>
+                </w:p>
+              </w:tc>
+            </w:tr>
+            <w:tr>
+              <w:trPr>
+                <w:cantSplit/>
+                <w:tblHeader w:val="off"/>
+              </w:trPr>
+              <w:tc>
+                <w:tcPr>
+                  <w:tcW w:type="dxa" w:w="4326"/>
+                  <w:tcMar>
+                    <w:top w:type="dxa" w:w="70"/>
+                    <w:left w:type="dxa" w:w="100"/>
+                    <w:bottom w:type="dxa" w:w="70"/>
+                    <w:right w:type="dxa" w:w="100"/>
+                  </w:tcMar>
+                  <w:vAlign w:val="center"/>
+                </w:tcPr>
+                <w:p>
+                  <w:pPr>
+                    <w:spacing w:after="0"/>
+                  </w:pPr>
+                  <w:r>
+                    <w:rPr>
+                      <w:b/>
+                      <w:bCs/>
+                      <w:sz w:val="18"/>
+                      <w:szCs w:val="18"/>
+                    </w:rPr>
+                    <w:t xml:space="preserve">No quedan fuera: se agregan como casos de estudio</w:t>
+                  </w:r>
+                </w:p>
+              </w:tc>
+              <w:tc>
+                <w:tcPr>
+                  <w:tcW w:type="dxa" w:w="899"/>
+                  <w:tcMar>
+                    <w:top w:type="dxa" w:w="70"/>
+                    <w:left w:type="dxa" w:w="100"/>
+                    <w:bottom w:type="dxa" w:w="70"/>
+                    <w:right w:type="dxa" w:w="100"/>
+                  </w:tcMar>
+                  <w:vAlign w:val="center"/>
+                </w:tcPr>
+                <w:p>
+                  <w:pPr>
+                    <w:spacing w:after="0"/>
+                  </w:pPr>
+                  <w:r>
+                    <w:rPr>
+                      <w:b/>
+                      <w:bCs/>
+                      <w:sz w:val="18"/>
+                      <w:szCs w:val="18"/>
+                    </w:rPr>
+                    <w:t xml:space="preserve">71.808</w:t>
+                  </w:r>
+                </w:p>
+              </w:tc>
+              <w:tc>
+                <w:tcPr>
+                  <w:tcW w:type="dxa" w:w="899"/>
+                  <w:tcMar>
+                    <w:top w:type="dxa" w:w="70"/>
+                    <w:left w:type="dxa" w:w="100"/>
+                    <w:bottom w:type="dxa" w:w="70"/>
+                    <w:right w:type="dxa" w:w="100"/>
+                  </w:tcMar>
+                  <w:vAlign w:val="center"/>
+                </w:tcPr>
+                <w:p>
+                  <w:pPr>
+                    <w:spacing w:after="0"/>
+                  </w:pPr>
+                  <w:r>
+                    <w:rPr>
+                      <w:b/>
+                      <w:bCs/>
+                      <w:sz w:val="18"/>
+                      <w:szCs w:val="18"/>
+                    </w:rPr>
+                    <w:t xml:space="preserve">21.981</w:t>
+                  </w:r>
+                </w:p>
+              </w:tc>
+              <w:tc>
+                <w:tcPr>
+                  <w:tcW w:type="dxa" w:w="902"/>
+                  <w:tcMar>
+                    <w:top w:type="dxa" w:w="70"/>
+                    <w:left w:type="dxa" w:w="100"/>
+                    <w:bottom w:type="dxa" w:w="70"/>
+                    <w:right w:type="dxa" w:w="100"/>
+                  </w:tcMar>
+                  <w:vAlign w:val="center"/>
+                </w:tcPr>
+                <w:p>
+                  <w:pPr>
+                    <w:spacing w:after="0"/>
+                  </w:pPr>
+                  <w:r>
+                    <w:rPr>
+                      <w:b/>
+                      <w:bCs/>
+                      <w:sz w:val="18"/>
+                      <w:szCs w:val="18"/>
+                    </w:rPr>
+                    <w:t xml:space="preserve">93.789</w:t>
+                  </w:r>
+                </w:p>
+              </w:tc>
+            </w:tr>
+            <w:tr>
+              <w:trPr>
+                <w:cantSplit/>
+                <w:tblHeader w:val="off"/>
+              </w:trPr>
+              <w:tc>
+                <w:tcPr>
+                  <w:tcW w:type="dxa" w:w="4326"/>
+                  <w:tcMar>
+                    <w:top w:type="dxa" w:w="70"/>
+                    <w:left w:type="dxa" w:w="100"/>
+                    <w:bottom w:type="dxa" w:w="70"/>
+                    <w:right w:type="dxa" w:w="100"/>
+                  </w:tcMar>
+                  <w:vAlign w:val="center"/>
+                </w:tcPr>
+                <w:p>
+                  <w:pPr>
+                    <w:spacing w:after="0"/>
+                  </w:pPr>
+                  <w:r>
+                    <w:rPr>
+                      <w:b/>
+                      <w:bCs/>
+                      <w:sz w:val="18"/>
+                      <w:szCs w:val="18"/>
+                    </w:rPr>
+                    <w:t xml:space="preserve">Total de derivados excluidos en el análisis principal</w:t>
+                  </w:r>
+                </w:p>
+              </w:tc>
+              <w:tc>
+                <w:tcPr>
+                  <w:tcW w:type="dxa" w:w="899"/>
+                  <w:tcMar>
+                    <w:top w:type="dxa" w:w="70"/>
+                    <w:left w:type="dxa" w:w="100"/>
+                    <w:bottom w:type="dxa" w:w="70"/>
+                    <w:right w:type="dxa" w:w="100"/>
+                  </w:tcMar>
+                  <w:vAlign w:val="center"/>
+                </w:tcPr>
+                <w:p>
+                  <w:pPr>
+                    <w:spacing w:after="0"/>
+                  </w:pPr>
+                  <w:r>
+                    <w:rPr>
+                      <w:b/>
+                      <w:bCs/>
+                      <w:sz w:val="18"/>
+                      <w:szCs w:val="18"/>
+                    </w:rPr>
+                    <w:t xml:space="preserve">76.605</w:t>
+                  </w:r>
+                </w:p>
+              </w:tc>
+              <w:tc>
+                <w:tcPr>
+                  <w:tcW w:type="dxa" w:w="899"/>
+                  <w:tcMar>
+                    <w:top w:type="dxa" w:w="70"/>
+                    <w:left w:type="dxa" w:w="100"/>
+                    <w:bottom w:type="dxa" w:w="70"/>
+                    <w:right w:type="dxa" w:w="100"/>
+                  </w:tcMar>
+                  <w:vAlign w:val="center"/>
+                </w:tcPr>
+                <w:p>
+                  <w:pPr>
+                    <w:spacing w:after="0"/>
+                  </w:pPr>
+                  <w:r>
+                    <w:rPr>
+                      <w:b/>
+                      <w:bCs/>
+                      <w:sz w:val="18"/>
+                      <w:szCs w:val="18"/>
+                    </w:rPr>
+                    <w:t xml:space="preserve">22.968</w:t>
+                  </w:r>
+                </w:p>
+              </w:tc>
+              <w:tc>
+                <w:tcPr>
+                  <w:tcW w:type="dxa" w:w="902"/>
+                  <w:tcMar>
+                    <w:top w:type="dxa" w:w="70"/>
+                    <w:left w:type="dxa" w:w="100"/>
+                    <w:bottom w:type="dxa" w:w="70"/>
+                    <w:right w:type="dxa" w:w="100"/>
+                  </w:tcMar>
+                  <w:vAlign w:val="center"/>
+                </w:tcPr>
+                <w:p>
+                  <w:pPr>
+                    <w:spacing w:after="0"/>
+                  </w:pPr>
+                  <w:r>
+                    <w:rPr>
+                      <w:b/>
+                      <w:bCs/>
+                      <w:sz w:val="18"/>
+                      <w:szCs w:val="18"/>
+                    </w:rPr>
+                    <w:t xml:space="preserve">99.573</w:t>
+                  </w:r>
+                </w:p>
+              </w:tc>
+            </w:tr>
+          </w:tbl>
+          <w:p>
+            <w:pPr>
+              <w:keepNext/>
+              <w:spacing w:after="0" w:before="100"/>
+            </w:pPr>
+            <w:r>
+              <w:rPr>
+                <w:sz w:val="20"/>
+                <w:szCs w:val="20"/>
+              </w:rPr>
+              <w:t xml:space="preserve">La mayoría (4.231, el 73 %) queda fuera por falta de seguimiento y el resto por los mismos criterios que se aplican a cualquier alta. De los 93.789 que se agregan, 2.195 tienen el alta entre 37 y 59 días antes del cierre: tienen las variables de 7 días y quedan sin dato en las de 30, como cualquier caso de estudio en esa situación (</w:t>
+            </w:r>
+            <w:hyperlink w:history="1" w:anchor="E_D30">
+              <w:r>
+                <w:rPr>
+                  <w:color w:val="0563C1"/>
+                  <w:sz w:val="20"/>
+                  <w:szCs w:val="20"/>
+                  <w:u w:val="single"/>
+                </w:rPr>
+                <w:t xml:space="preserve">D30</w:t>
+              </w:r>
+            </w:hyperlink>
+            <w:r>
+              <w:rPr>
+                <w:sz w:val="20"/>
+                <w:szCs w:val="20"/>
+              </w:rPr>
+              <w:t xml:space="preserve">). El desglose está en la sección 9 del reporte 11.</w:t>
+            </w:r>
+          </w:p>
+        </w:tc>
+      </w:tr>
+      <w:tr>
+        <w:trPr>
+          <w:cantSplit/>
+        </w:trPr>
+        <w:tc>
+          <w:tcPr>
+            <w:tcW w:type="dxa" w:w="1800"/>
+            <w:shd w:fill="F2F2F2" w:color="auto" w:val="clear"/>
+            <w:tcMar>
+              <w:top w:type="dxa" w:w="70"/>
+              <w:left w:type="dxa" w:w="100"/>
+              <w:bottom w:type="dxa" w:w="70"/>
+              <w:right w:type="dxa" w:w="100"/>
+            </w:tcMar>
+          </w:tcPr>
+          <w:p>
+            <w:pPr>
+              <w:keepNext/>
+              <w:spacing w:after="0"/>
+            </w:pPr>
+            <w:r>
+              <w:rPr>
+                <w:b/>
+                <w:bCs/>
+                <w:color w:val="404040"/>
+                <w:sz w:val="20"/>
+                <w:szCs w:val="20"/>
+              </w:rPr>
               <w:t xml:space="preserve">Visto bueno</w:t>
             </w:r>
           </w:p>
@@ -31414,7 +32423,7 @@
                 <w:sz w:val="20"/>
                 <w:szCs w:val="20"/>
               </w:rPr>
-              <w:t xml:space="preserve">Adoptada.</w:t>
+              <w:t xml:space="preserve">Adoptada. Aprobada por el profesor guía el 24 de octubre de 2026, que pidió explicar la diferencia de 5.784 casos entre los derivados excluidos y los agregados (observación O4): se agregó el 26 de octubre, en el campo «Derivados que no se agregan».</w:t>
             </w:r>
           </w:p>
         </w:tc>
@@ -33204,6 +34213,1343 @@
                 <w:szCs w:val="20"/>
               </w:rPr>
               <w:t xml:space="preserve">, sección 2 («Calidad del identificador»).</w:t>
+            </w:r>
+          </w:p>
+        </w:tc>
+      </w:tr>
+    </w:tbl>
+    <w:p>
+      <w:pPr>
+        <w:pStyle w:val="Heading2"/>
+      </w:pPr>
+      <w:bookmarkStart w:name="E_H29" w:id="34"/>
+      <w:r>
+        <w:rPr>
+          <w:color w:val="2E75B6"/>
+        </w:rPr>
+        <w:t xml:space="preserve">H29</w:t>
+      </w:r>
+      <w:bookmarkEnd w:id="34"/>
+      <w:r>
+        <w:t xml:space="preserve"> · Por qué exigir la marca de traslado suma menos reingresos que episodios separa</w:t>
+      </w:r>
+    </w:p>
+    <w:p>
+      <w:pPr>
+        <w:keepNext/>
+        <w:spacing w:after="100"/>
+      </w:pPr>
+      <w:r>
+        <w:rPr>
+          <w:b/>
+          <w:bCs/>
+          <w:color w:val="2E75B6"/>
+          <w:sz w:val="18"/>
+          <w:szCs w:val="18"/>
+        </w:rPr>
+        <w:t xml:space="preserve">Hallazgo</w:t>
+      </w:r>
+      <w:r>
+        <w:rPr>
+          <w:color w:val="808080"/>
+          <w:sz w:val="18"/>
+          <w:szCs w:val="18"/>
+        </w:rPr>
+        <w:t xml:space="preserve">  ·  26 de octubre de 2026</w:t>
+      </w:r>
+    </w:p>
+    <w:tbl>
+      <w:tblPr>
+        <w:tblW w:type="dxa" w:w="9026"/>
+        <w:tblBorders>
+          <w:top w:val="single" w:color="BFBFBF" w:sz="4"/>
+          <w:left w:val="single" w:color="BFBFBF" w:sz="4"/>
+          <w:bottom w:val="single" w:color="BFBFBF" w:sz="4"/>
+          <w:right w:val="single" w:color="BFBFBF" w:sz="4"/>
+          <w:insideH w:val="single" w:color="BFBFBF" w:sz="4"/>
+          <w:insideV w:val="single" w:color="BFBFBF" w:sz="4"/>
+        </w:tblBorders>
+        <w:tblLayout w:type="fixed"/>
+      </w:tblPr>
+      <w:tblGrid>
+        <w:gridCol w:w="1800"/>
+        <w:gridCol w:w="7226"/>
+      </w:tblGrid>
+      <w:tr>
+        <w:trPr>
+          <w:cantSplit/>
+        </w:trPr>
+        <w:tc>
+          <w:tcPr>
+            <w:tcW w:type="dxa" w:w="1800"/>
+            <w:shd w:fill="F2F2F2" w:color="auto" w:val="clear"/>
+            <w:tcMar>
+              <w:top w:type="dxa" w:w="70"/>
+              <w:left w:type="dxa" w:w="100"/>
+              <w:bottom w:type="dxa" w:w="70"/>
+              <w:right w:type="dxa" w:w="100"/>
+            </w:tcMar>
+          </w:tcPr>
+          <w:p>
+            <w:pPr>
+              <w:keepNext/>
+              <w:spacing w:after="0"/>
+            </w:pPr>
+            <w:r>
+              <w:rPr>
+                <w:b/>
+                <w:bCs/>
+                <w:color w:val="404040"/>
+                <w:sz w:val="20"/>
+                <w:szCs w:val="20"/>
+              </w:rPr>
+              <w:t xml:space="preserve">Actividad</w:t>
+            </w:r>
+          </w:p>
+        </w:tc>
+        <w:tc>
+          <w:tcPr>
+            <w:tcW w:type="dxa" w:w="7226"/>
+            <w:tcMar>
+              <w:top w:type="dxa" w:w="70"/>
+              <w:left w:type="dxa" w:w="100"/>
+              <w:bottom w:type="dxa" w:w="70"/>
+              <w:right w:type="dxa" w:w="100"/>
+            </w:tcMar>
+          </w:tcPr>
+          <w:p>
+            <w:pPr>
+              <w:keepNext/>
+              <w:spacing w:after="0" w:before="0"/>
+            </w:pPr>
+            <w:r>
+              <w:rPr>
+                <w:sz w:val="20"/>
+                <w:szCs w:val="20"/>
+              </w:rPr>
+              <w:t xml:space="preserve">2.2</w:t>
+            </w:r>
+          </w:p>
+        </w:tc>
+      </w:tr>
+      <w:tr>
+        <w:trPr>
+          <w:cantSplit/>
+        </w:trPr>
+        <w:tc>
+          <w:tcPr>
+            <w:tcW w:type="dxa" w:w="1800"/>
+            <w:shd w:fill="F2F2F2" w:color="auto" w:val="clear"/>
+            <w:tcMar>
+              <w:top w:type="dxa" w:w="70"/>
+              <w:left w:type="dxa" w:w="100"/>
+              <w:bottom w:type="dxa" w:w="70"/>
+              <w:right w:type="dxa" w:w="100"/>
+            </w:tcMar>
+          </w:tcPr>
+          <w:p>
+            <w:pPr>
+              <w:keepNext/>
+              <w:spacing w:after="0"/>
+            </w:pPr>
+            <w:r>
+              <w:rPr>
+                <w:b/>
+                <w:bCs/>
+                <w:color w:val="404040"/>
+                <w:sz w:val="20"/>
+                <w:szCs w:val="20"/>
+              </w:rPr>
+              <w:t xml:space="preserve">Contexto</w:t>
+            </w:r>
+          </w:p>
+        </w:tc>
+        <w:tc>
+          <w:tcPr>
+            <w:tcW w:type="dxa" w:w="7226"/>
+            <w:tcMar>
+              <w:top w:type="dxa" w:w="70"/>
+              <w:left w:type="dxa" w:w="100"/>
+              <w:bottom w:type="dxa" w:w="70"/>
+              <w:right w:type="dxa" w:w="100"/>
+            </w:tcMar>
+          </w:tcPr>
+          <w:p>
+            <w:pPr>
+              <w:keepNext/>
+              <w:spacing w:after="0" w:before="0"/>
+            </w:pPr>
+            <w:r>
+              <w:rPr>
+                <w:sz w:val="20"/>
+                <w:szCs w:val="20"/>
+              </w:rPr>
+              <w:t xml:space="preserve">En su revisión del 24 de octubre de 2026 (observación O3), el profesor guía señaló que, al exigir la marca de traslado (</w:t>
+            </w:r>
+            <w:hyperlink w:history="1" w:anchor="E_H27">
+              <w:r>
+                <w:rPr>
+                  <w:color w:val="0563C1"/>
+                  <w:sz w:val="20"/>
+                  <w:szCs w:val="20"/>
+                  <w:u w:val="single"/>
+                </w:rPr>
+                <w:t xml:space="preserve">H27</w:t>
+              </w:r>
+            </w:hyperlink>
+            <w:r>
+              <w:rPr>
+                <w:sz w:val="20"/>
+                <w:szCs w:val="20"/>
+              </w:rPr>
+              <w:t xml:space="preserve">), se separan 3.755 episodios que antes quedaban unidos, pero los casos con </w:t>
+            </w:r>
+            <w:r>
+              <w:rPr>
+                <w:rFonts w:ascii="Consolas" w:cs="Consolas" w:eastAsia="Consolas" w:hAnsi="Consolas"/>
+                <w:sz w:val="18"/>
+                <w:szCs w:val="18"/>
+                <w:shd w:fill="F2F2F2" w:color="auto" w:val="clear"/>
+              </w:rPr>
+              <w:t xml:space="preserve">REING_7D</w:t>
+            </w:r>
+            <w:r>
+              <w:rPr>
+                <w:sz w:val="20"/>
+                <w:szCs w:val="20"/>
+              </w:rPr>
+              <w:t xml:space="preserve"> suben solo en 2.133 (de 86.609 a 88.742) y los casos de estudio, en 3.376. Como cada episodio separado comienza dentro de los 7 días posteriores a un alta, esperaba un aumento cercano a 3.755, y planteó tres posibles causas: altas anteriores que ya tenían un reingreso, cadenas de más de dos tramos o criterios de exclusión. Pidió agregar el desglose al reporte 11.</w:t>
+            </w:r>
+          </w:p>
+        </w:tc>
+      </w:tr>
+      <w:tr>
+        <w:trPr>
+          <w:cantSplit/>
+        </w:trPr>
+        <w:tc>
+          <w:tcPr>
+            <w:tcW w:type="dxa" w:w="1800"/>
+            <w:shd w:fill="F2F2F2" w:color="auto" w:val="clear"/>
+            <w:tcMar>
+              <w:top w:type="dxa" w:w="70"/>
+              <w:left w:type="dxa" w:w="100"/>
+              <w:bottom w:type="dxa" w:w="70"/>
+              <w:right w:type="dxa" w:w="100"/>
+            </w:tcMar>
+          </w:tcPr>
+          <w:p>
+            <w:pPr>
+              <w:keepNext/>
+              <w:spacing w:after="0"/>
+            </w:pPr>
+            <w:r>
+              <w:rPr>
+                <w:b/>
+                <w:bCs/>
+                <w:color w:val="404040"/>
+                <w:sz w:val="20"/>
+                <w:szCs w:val="20"/>
+              </w:rPr>
+              <w:t xml:space="preserve">Hallazgo</w:t>
+            </w:r>
+          </w:p>
+        </w:tc>
+        <w:tc>
+          <w:tcPr>
+            <w:tcW w:type="dxa" w:w="7226"/>
+            <w:tcMar>
+              <w:top w:type="dxa" w:w="70"/>
+              <w:left w:type="dxa" w:w="100"/>
+              <w:bottom w:type="dxa" w:w="70"/>
+              <w:right w:type="dxa" w:w="100"/>
+            </w:tcMar>
+          </w:tcPr>
+          <w:p>
+            <w:pPr>
+              <w:keepNext/>
+              <w:spacing w:after="80" w:before="0"/>
+            </w:pPr>
+            <w:r>
+              <w:rPr>
+                <w:sz w:val="20"/>
+                <w:szCs w:val="20"/>
+              </w:rPr>
+              <w:t xml:space="preserve">Cada ingreso que deja de unirse tiene su propia alta anterior, que pasa a cerrar un episodio. Ninguna de esas altas era caso de estudio en el análisis principal (eran tramos de un traslado, E05), así que ninguna «ya tenía» un reingreso. El aumento es menor por dos razones: parte de las altas anteriores queda fuera por otro criterio, y un tercio de los ingresos separados no cuenta como reingreso no planificado.</w:t>
+            </w:r>
+          </w:p>
+          <w:tbl>
+            <w:tblPr>
+              <w:tblW w:type="dxa" w:w="7026"/>
+              <w:tblBorders>
+                <w:top w:val="single" w:color="BFBFBF" w:sz="4"/>
+                <w:left w:val="single" w:color="BFBFBF" w:sz="4"/>
+                <w:bottom w:val="single" w:color="BFBFBF" w:sz="4"/>
+                <w:right w:val="single" w:color="BFBFBF" w:sz="4"/>
+                <w:insideH w:val="single" w:color="BFBFBF" w:sz="4"/>
+                <w:insideV w:val="single" w:color="BFBFBF" w:sz="4"/>
+              </w:tblBorders>
+              <w:tblLayout w:type="fixed"/>
+            </w:tblPr>
+            <w:tblGrid>
+              <w:gridCol w:w="5375"/>
+              <w:gridCol w:w="1651"/>
+            </w:tblGrid>
+            <w:tr>
+              <w:trPr>
+                <w:cantSplit/>
+                <w:tblHeader/>
+              </w:trPr>
+              <w:tc>
+                <w:tcPr>
+                  <w:tcW w:type="dxa" w:w="5375"/>
+                  <w:shd w:fill="D9E2F3" w:color="auto" w:val="clear"/>
+                  <w:tcMar>
+                    <w:top w:type="dxa" w:w="70"/>
+                    <w:left w:type="dxa" w:w="100"/>
+                    <w:bottom w:type="dxa" w:w="70"/>
+                    <w:right w:type="dxa" w:w="100"/>
+                  </w:tcMar>
+                  <w:vAlign w:val="center"/>
+                </w:tcPr>
+                <w:p>
+                  <w:pPr>
+                    <w:spacing w:after="0"/>
+                  </w:pPr>
+                </w:p>
+              </w:tc>
+              <w:tc>
+                <w:tcPr>
+                  <w:tcW w:type="dxa" w:w="1651"/>
+                  <w:shd w:fill="D9E2F3" w:color="auto" w:val="clear"/>
+                  <w:tcMar>
+                    <w:top w:type="dxa" w:w="70"/>
+                    <w:left w:type="dxa" w:w="100"/>
+                    <w:bottom w:type="dxa" w:w="70"/>
+                    <w:right w:type="dxa" w:w="100"/>
+                  </w:tcMar>
+                  <w:vAlign w:val="center"/>
+                </w:tcPr>
+                <w:p>
+                  <w:pPr>
+                    <w:spacing w:after="0"/>
+                  </w:pPr>
+                  <w:r>
+                    <w:rPr>
+                      <w:b/>
+                      <w:bCs/>
+                      <w:sz w:val="18"/>
+                      <w:szCs w:val="18"/>
+                    </w:rPr>
+                    <w:t xml:space="preserve">Cantidad</w:t>
+                  </w:r>
+                </w:p>
+              </w:tc>
+            </w:tr>
+            <w:tr>
+              <w:trPr>
+                <w:cantSplit/>
+                <w:tblHeader w:val="off"/>
+              </w:trPr>
+              <w:tc>
+                <w:tcPr>
+                  <w:tcW w:type="dxa" w:w="5375"/>
+                  <w:tcMar>
+                    <w:top w:type="dxa" w:w="70"/>
+                    <w:left w:type="dxa" w:w="100"/>
+                    <w:bottom w:type="dxa" w:w="70"/>
+                    <w:right w:type="dxa" w:w="100"/>
+                  </w:tcMar>
+                  <w:vAlign w:val="center"/>
+                </w:tcPr>
+                <w:p>
+                  <w:pPr>
+                    <w:spacing w:after="0"/>
+                  </w:pPr>
+                  <w:r>
+                    <w:rPr>
+                      <w:sz w:val="18"/>
+                      <w:szCs w:val="18"/>
+                    </w:rPr>
+                    <w:t xml:space="preserve">Ingresos que dejan de unirse</w:t>
+                  </w:r>
+                </w:p>
+              </w:tc>
+              <w:tc>
+                <w:tcPr>
+                  <w:tcW w:type="dxa" w:w="1651"/>
+                  <w:tcMar>
+                    <w:top w:type="dxa" w:w="70"/>
+                    <w:left w:type="dxa" w:w="100"/>
+                    <w:bottom w:type="dxa" w:w="70"/>
+                    <w:right w:type="dxa" w:w="100"/>
+                  </w:tcMar>
+                  <w:vAlign w:val="center"/>
+                </w:tcPr>
+                <w:p>
+                  <w:pPr>
+                    <w:spacing w:after="0"/>
+                  </w:pPr>
+                  <w:r>
+                    <w:rPr>
+                      <w:sz w:val="18"/>
+                      <w:szCs w:val="18"/>
+                    </w:rPr>
+                    <w:t xml:space="preserve">3.755</w:t>
+                  </w:r>
+                </w:p>
+              </w:tc>
+            </w:tr>
+            <w:tr>
+              <w:trPr>
+                <w:cantSplit/>
+                <w:tblHeader w:val="off"/>
+              </w:trPr>
+              <w:tc>
+                <w:tcPr>
+                  <w:tcW w:type="dxa" w:w="5375"/>
+                  <w:tcMar>
+                    <w:top w:type="dxa" w:w="70"/>
+                    <w:left w:type="dxa" w:w="100"/>
+                    <w:bottom w:type="dxa" w:w="70"/>
+                    <w:right w:type="dxa" w:w="100"/>
+                  </w:tcMar>
+                  <w:vAlign w:val="center"/>
+                </w:tcPr>
+                <w:p>
+                  <w:pPr>
+                    <w:spacing w:after="0"/>
+                  </w:pPr>
+                  <w:r>
+                    <w:rPr>
+                      <w:sz w:val="18"/>
+                      <w:szCs w:val="18"/>
+                    </w:rPr>
+                    <w:t xml:space="preserve">Alta anterior que no es caso de estudio por otro criterio: E13 (229), E11 (101), E14 (35), E06 (11) y E09 (3)</w:t>
+                  </w:r>
+                </w:p>
+              </w:tc>
+              <w:tc>
+                <w:tcPr>
+                  <w:tcW w:type="dxa" w:w="1651"/>
+                  <w:tcMar>
+                    <w:top w:type="dxa" w:w="70"/>
+                    <w:left w:type="dxa" w:w="100"/>
+                    <w:bottom w:type="dxa" w:w="70"/>
+                    <w:right w:type="dxa" w:w="100"/>
+                  </w:tcMar>
+                  <w:vAlign w:val="center"/>
+                </w:tcPr>
+                <w:p>
+                  <w:pPr>
+                    <w:spacing w:after="0"/>
+                  </w:pPr>
+                  <w:r>
+                    <w:rPr>
+                      <w:sz w:val="18"/>
+                      <w:szCs w:val="18"/>
+                    </w:rPr>
+                    <w:t xml:space="preserve">−379</w:t>
+                  </w:r>
+                </w:p>
+              </w:tc>
+            </w:tr>
+            <w:tr>
+              <w:trPr>
+                <w:cantSplit/>
+                <w:tblHeader w:val="off"/>
+              </w:trPr>
+              <w:tc>
+                <w:tcPr>
+                  <w:tcW w:type="dxa" w:w="5375"/>
+                  <w:tcMar>
+                    <w:top w:type="dxa" w:w="70"/>
+                    <w:left w:type="dxa" w:w="100"/>
+                    <w:bottom w:type="dxa" w:w="70"/>
+                    <w:right w:type="dxa" w:w="100"/>
+                  </w:tcMar>
+                  <w:vAlign w:val="center"/>
+                </w:tcPr>
+                <w:p>
+                  <w:pPr>
+                    <w:spacing w:after="0"/>
+                  </w:pPr>
+                  <w:r>
+                    <w:rPr>
+                      <w:b/>
+                      <w:bCs/>
+                      <w:sz w:val="18"/>
+                      <w:szCs w:val="18"/>
+                    </w:rPr>
+                    <w:t xml:space="preserve">Casos de estudio que se agregan</w:t>
+                  </w:r>
+                </w:p>
+              </w:tc>
+              <w:tc>
+                <w:tcPr>
+                  <w:tcW w:type="dxa" w:w="1651"/>
+                  <w:tcMar>
+                    <w:top w:type="dxa" w:w="70"/>
+                    <w:left w:type="dxa" w:w="100"/>
+                    <w:bottom w:type="dxa" w:w="70"/>
+                    <w:right w:type="dxa" w:w="100"/>
+                  </w:tcMar>
+                  <w:vAlign w:val="center"/>
+                </w:tcPr>
+                <w:p>
+                  <w:pPr>
+                    <w:spacing w:after="0"/>
+                  </w:pPr>
+                  <w:r>
+                    <w:rPr>
+                      <w:b/>
+                      <w:bCs/>
+                      <w:sz w:val="18"/>
+                      <w:szCs w:val="18"/>
+                    </w:rPr>
+                    <w:t xml:space="preserve">3.376</w:t>
+                  </w:r>
+                </w:p>
+              </w:tc>
+            </w:tr>
+            <w:tr>
+              <w:trPr>
+                <w:cantSplit/>
+                <w:tblHeader w:val="off"/>
+              </w:trPr>
+              <w:tc>
+                <w:tcPr>
+                  <w:tcW w:type="dxa" w:w="5375"/>
+                  <w:tcMar>
+                    <w:top w:type="dxa" w:w="70"/>
+                    <w:left w:type="dxa" w:w="100"/>
+                    <w:bottom w:type="dxa" w:w="70"/>
+                    <w:right w:type="dxa" w:w="100"/>
+                  </w:tcMar>
+                  <w:vAlign w:val="center"/>
+                </w:tcPr>
+                <w:p>
+                  <w:pPr>
+                    <w:spacing w:after="0"/>
+                  </w:pPr>
+                  <w:r>
+                    <w:rPr>
+                      <w:sz w:val="18"/>
+                      <w:szCs w:val="18"/>
+                    </w:rPr>
+                    <w:t xml:space="preserve">… con </w:t>
+                  </w:r>
+                  <w:r>
+                    <w:rPr>
+                      <w:rFonts w:ascii="Consolas" w:cs="Consolas" w:eastAsia="Consolas" w:hAnsi="Consolas"/>
+                      <w:sz w:val="16"/>
+                      <w:szCs w:val="16"/>
+                      <w:shd w:fill="F2F2F2" w:color="auto" w:val="clear"/>
+                    </w:rPr>
+                    <w:t xml:space="preserve">REING_7D</w:t>
+                  </w:r>
+                  <w:r>
+                    <w:rPr>
+                      <w:sz w:val="18"/>
+                      <w:szCs w:val="18"/>
+                    </w:rPr>
+                    <w:t xml:space="preserve"> = 1, porque el ingreso separado es un reingreso no planificado</w:t>
+                  </w:r>
+                </w:p>
+              </w:tc>
+              <w:tc>
+                <w:tcPr>
+                  <w:tcW w:type="dxa" w:w="1651"/>
+                  <w:tcMar>
+                    <w:top w:type="dxa" w:w="70"/>
+                    <w:left w:type="dxa" w:w="100"/>
+                    <w:bottom w:type="dxa" w:w="70"/>
+                    <w:right w:type="dxa" w:w="100"/>
+                  </w:tcMar>
+                  <w:vAlign w:val="center"/>
+                </w:tcPr>
+                <w:p>
+                  <w:pPr>
+                    <w:spacing w:after="0"/>
+                  </w:pPr>
+                  <w:r>
+                    <w:rPr>
+                      <w:sz w:val="18"/>
+                      <w:szCs w:val="18"/>
+                    </w:rPr>
+                    <w:t xml:space="preserve">2.116</w:t>
+                  </w:r>
+                </w:p>
+              </w:tc>
+            </w:tr>
+            <w:tr>
+              <w:trPr>
+                <w:cantSplit/>
+                <w:tblHeader w:val="off"/>
+              </w:trPr>
+              <w:tc>
+                <w:tcPr>
+                  <w:tcW w:type="dxa" w:w="5375"/>
+                  <w:tcMar>
+                    <w:top w:type="dxa" w:w="70"/>
+                    <w:left w:type="dxa" w:w="100"/>
+                    <w:bottom w:type="dxa" w:w="70"/>
+                    <w:right w:type="dxa" w:w="100"/>
+                  </w:tcMar>
+                  <w:vAlign w:val="center"/>
+                </w:tcPr>
+                <w:p>
+                  <w:pPr>
+                    <w:spacing w:after="0"/>
+                  </w:pPr>
+                  <w:r>
+                    <w:rPr>
+                      <w:sz w:val="18"/>
+                      <w:szCs w:val="18"/>
+                    </w:rPr>
+                    <w:t xml:space="preserve">… con </w:t>
+                  </w:r>
+                  <w:r>
+                    <w:rPr>
+                      <w:rFonts w:ascii="Consolas" w:cs="Consolas" w:eastAsia="Consolas" w:hAnsi="Consolas"/>
+                      <w:sz w:val="16"/>
+                      <w:szCs w:val="16"/>
+                      <w:shd w:fill="F2F2F2" w:color="auto" w:val="clear"/>
+                    </w:rPr>
+                    <w:t xml:space="preserve">REING_7D</w:t>
+                  </w:r>
+                  <w:r>
+                    <w:rPr>
+                      <w:sz w:val="18"/>
+                      <w:szCs w:val="18"/>
+                    </w:rPr>
+                    <w:t xml:space="preserve"> = 1 por otro ingreso no planificado dentro de los 7 días</w:t>
+                  </w:r>
+                </w:p>
+              </w:tc>
+              <w:tc>
+                <w:tcPr>
+                  <w:tcW w:type="dxa" w:w="1651"/>
+                  <w:tcMar>
+                    <w:top w:type="dxa" w:w="70"/>
+                    <w:left w:type="dxa" w:w="100"/>
+                    <w:bottom w:type="dxa" w:w="70"/>
+                    <w:right w:type="dxa" w:w="100"/>
+                  </w:tcMar>
+                  <w:vAlign w:val="center"/>
+                </w:tcPr>
+                <w:p>
+                  <w:pPr>
+                    <w:spacing w:after="0"/>
+                  </w:pPr>
+                  <w:r>
+                    <w:rPr>
+                      <w:sz w:val="18"/>
+                      <w:szCs w:val="18"/>
+                    </w:rPr>
+                    <w:t xml:space="preserve">8</w:t>
+                  </w:r>
+                </w:p>
+              </w:tc>
+            </w:tr>
+            <w:tr>
+              <w:trPr>
+                <w:cantSplit/>
+                <w:tblHeader w:val="off"/>
+              </w:trPr>
+              <w:tc>
+                <w:tcPr>
+                  <w:tcW w:type="dxa" w:w="5375"/>
+                  <w:tcMar>
+                    <w:top w:type="dxa" w:w="70"/>
+                    <w:left w:type="dxa" w:w="100"/>
+                    <w:bottom w:type="dxa" w:w="70"/>
+                    <w:right w:type="dxa" w:w="100"/>
+                  </w:tcMar>
+                  <w:vAlign w:val="center"/>
+                </w:tcPr>
+                <w:p>
+                  <w:pPr>
+                    <w:spacing w:after="0"/>
+                  </w:pPr>
+                  <w:r>
+                    <w:rPr>
+                      <w:sz w:val="18"/>
+                      <w:szCs w:val="18"/>
+                    </w:rPr>
+                    <w:t xml:space="preserve">… con </w:t>
+                  </w:r>
+                  <w:r>
+                    <w:rPr>
+                      <w:rFonts w:ascii="Consolas" w:cs="Consolas" w:eastAsia="Consolas" w:hAnsi="Consolas"/>
+                      <w:sz w:val="16"/>
+                      <w:szCs w:val="16"/>
+                      <w:shd w:fill="F2F2F2" w:color="auto" w:val="clear"/>
+                    </w:rPr>
+                    <w:t xml:space="preserve">REING_7D</w:t>
+                  </w:r>
+                  <w:r>
+                    <w:rPr>
+                      <w:sz w:val="18"/>
+                      <w:szCs w:val="18"/>
+                    </w:rPr>
+                    <w:t xml:space="preserve"> = 0: el ingreso separado es programado (909), un parto o una cesárea (317), una sesión de tratamiento (24) o no tiene tipo de ingreso (2)</w:t>
+                  </w:r>
+                </w:p>
+              </w:tc>
+              <w:tc>
+                <w:tcPr>
+                  <w:tcW w:type="dxa" w:w="1651"/>
+                  <w:tcMar>
+                    <w:top w:type="dxa" w:w="70"/>
+                    <w:left w:type="dxa" w:w="100"/>
+                    <w:bottom w:type="dxa" w:w="70"/>
+                    <w:right w:type="dxa" w:w="100"/>
+                  </w:tcMar>
+                  <w:vAlign w:val="center"/>
+                </w:tcPr>
+                <w:p>
+                  <w:pPr>
+                    <w:spacing w:after="0"/>
+                  </w:pPr>
+                  <w:r>
+                    <w:rPr>
+                      <w:sz w:val="18"/>
+                      <w:szCs w:val="18"/>
+                    </w:rPr>
+                    <w:t xml:space="preserve">1.252</w:t>
+                  </w:r>
+                </w:p>
+              </w:tc>
+            </w:tr>
+            <w:tr>
+              <w:trPr>
+                <w:cantSplit/>
+                <w:tblHeader w:val="off"/>
+              </w:trPr>
+              <w:tc>
+                <w:tcPr>
+                  <w:tcW w:type="dxa" w:w="5375"/>
+                  <w:tcMar>
+                    <w:top w:type="dxa" w:w="70"/>
+                    <w:left w:type="dxa" w:w="100"/>
+                    <w:bottom w:type="dxa" w:w="70"/>
+                    <w:right w:type="dxa" w:w="100"/>
+                  </w:tcMar>
+                  <w:vAlign w:val="center"/>
+                </w:tcPr>
+                <w:p>
+                  <w:pPr>
+                    <w:spacing w:after="0"/>
+                  </w:pPr>
+                  <w:r>
+                    <w:rPr>
+                      <w:sz w:val="18"/>
+                      <w:szCs w:val="18"/>
+                    </w:rPr>
+                    <w:t xml:space="preserve">Casos que ya eran de estudio y pasan de 0 a 1 en </w:t>
+                  </w:r>
+                  <w:r>
+                    <w:rPr>
+                      <w:rFonts w:ascii="Consolas" w:cs="Consolas" w:eastAsia="Consolas" w:hAnsi="Consolas"/>
+                      <w:sz w:val="16"/>
+                      <w:szCs w:val="16"/>
+                      <w:shd w:fill="F2F2F2" w:color="auto" w:val="clear"/>
+                    </w:rPr>
+                    <w:t xml:space="preserve">REING_7D</w:t>
+                  </w:r>
+                </w:p>
+              </w:tc>
+              <w:tc>
+                <w:tcPr>
+                  <w:tcW w:type="dxa" w:w="1651"/>
+                  <w:tcMar>
+                    <w:top w:type="dxa" w:w="70"/>
+                    <w:left w:type="dxa" w:w="100"/>
+                    <w:bottom w:type="dxa" w:w="70"/>
+                    <w:right w:type="dxa" w:w="100"/>
+                  </w:tcMar>
+                  <w:vAlign w:val="center"/>
+                </w:tcPr>
+                <w:p>
+                  <w:pPr>
+                    <w:spacing w:after="0"/>
+                  </w:pPr>
+                  <w:r>
+                    <w:rPr>
+                      <w:sz w:val="18"/>
+                      <w:szCs w:val="18"/>
+                    </w:rPr>
+                    <w:t xml:space="preserve">9</w:t>
+                  </w:r>
+                </w:p>
+              </w:tc>
+            </w:tr>
+            <w:tr>
+              <w:trPr>
+                <w:cantSplit/>
+                <w:tblHeader w:val="off"/>
+              </w:trPr>
+              <w:tc>
+                <w:tcPr>
+                  <w:tcW w:type="dxa" w:w="5375"/>
+                  <w:tcMar>
+                    <w:top w:type="dxa" w:w="70"/>
+                    <w:left w:type="dxa" w:w="100"/>
+                    <w:bottom w:type="dxa" w:w="70"/>
+                    <w:right w:type="dxa" w:w="100"/>
+                  </w:tcMar>
+                  <w:vAlign w:val="center"/>
+                </w:tcPr>
+                <w:p>
+                  <w:pPr>
+                    <w:spacing w:after="0"/>
+                  </w:pPr>
+                  <w:r>
+                    <w:rPr>
+                      <w:b/>
+                      <w:bCs/>
+                      <w:sz w:val="18"/>
+                      <w:szCs w:val="18"/>
+                    </w:rPr>
+                    <w:t xml:space="preserve">Aumento</w:t>
+                  </w:r>
+                  <w:r>
+                    <w:rPr>
+                      <w:sz w:val="18"/>
+                      <w:szCs w:val="18"/>
+                    </w:rPr>
+                    <w:t xml:space="preserve"> de casos con </w:t>
+                  </w:r>
+                  <w:r>
+                    <w:rPr>
+                      <w:rFonts w:ascii="Consolas" w:cs="Consolas" w:eastAsia="Consolas" w:hAnsi="Consolas"/>
+                      <w:sz w:val="16"/>
+                      <w:szCs w:val="16"/>
+                      <w:shd w:fill="F2F2F2" w:color="auto" w:val="clear"/>
+                    </w:rPr>
+                    <w:t xml:space="preserve">REING_7D</w:t>
+                  </w:r>
+                </w:p>
+              </w:tc>
+              <w:tc>
+                <w:tcPr>
+                  <w:tcW w:type="dxa" w:w="1651"/>
+                  <w:tcMar>
+                    <w:top w:type="dxa" w:w="70"/>
+                    <w:left w:type="dxa" w:w="100"/>
+                    <w:bottom w:type="dxa" w:w="70"/>
+                    <w:right w:type="dxa" w:w="100"/>
+                  </w:tcMar>
+                  <w:vAlign w:val="center"/>
+                </w:tcPr>
+                <w:p>
+                  <w:pPr>
+                    <w:spacing w:after="0"/>
+                  </w:pPr>
+                  <w:r>
+                    <w:rPr>
+                      <w:b/>
+                      <w:bCs/>
+                      <w:sz w:val="18"/>
+                      <w:szCs w:val="18"/>
+                    </w:rPr>
+                    <w:t xml:space="preserve">2.124 + 9 = 2.133</w:t>
+                  </w:r>
+                </w:p>
+              </w:tc>
+            </w:tr>
+          </w:tbl>
+          <w:p>
+            <w:pPr>
+              <w:spacing w:after="0"/>
+            </w:pPr>
+          </w:p>
+        </w:tc>
+      </w:tr>
+      <w:tr>
+        <w:trPr>
+          <w:cantSplit/>
+        </w:trPr>
+        <w:tc>
+          <w:tcPr>
+            <w:tcW w:type="dxa" w:w="1800"/>
+            <w:shd w:fill="F2F2F2" w:color="auto" w:val="clear"/>
+            <w:tcMar>
+              <w:top w:type="dxa" w:w="70"/>
+              <w:left w:type="dxa" w:w="100"/>
+              <w:bottom w:type="dxa" w:w="70"/>
+              <w:right w:type="dxa" w:w="100"/>
+            </w:tcMar>
+          </w:tcPr>
+          <w:p>
+            <w:pPr>
+              <w:keepNext/>
+              <w:spacing w:after="0"/>
+            </w:pPr>
+            <w:r>
+              <w:rPr>
+                <w:b/>
+                <w:bCs/>
+                <w:color w:val="404040"/>
+                <w:sz w:val="20"/>
+                <w:szCs w:val="20"/>
+              </w:rPr>
+              <w:t xml:space="preserve">Las tres causas que planteó la revisión</w:t>
+            </w:r>
+          </w:p>
+        </w:tc>
+        <w:tc>
+          <w:tcPr>
+            <w:tcW w:type="dxa" w:w="7226"/>
+            <w:tcMar>
+              <w:top w:type="dxa" w:w="70"/>
+              <w:left w:type="dxa" w:w="100"/>
+              <w:bottom w:type="dxa" w:w="70"/>
+              <w:right w:type="dxa" w:w="100"/>
+            </w:tcMar>
+          </w:tcPr>
+          <w:p>
+            <w:pPr>
+              <w:keepNext/>
+              <w:spacing w:after="0" w:before="0"/>
+            </w:pPr>
+            <w:r>
+              <w:rPr>
+                <w:sz w:val="20"/>
+                <w:szCs w:val="20"/>
+              </w:rPr>
+              <w:t xml:space="preserve">Las cadenas casi no influyen: los 3.755 ingresos vienen de 3.719 episodios (34 con dos separaciones y 1 con tres), y cada separación tiene su propia alta anterior, así que una cadena no reduce el aumento. Los criterios de exclusión explican 379 casos, sobre todo cirugía mayor ambulatoria seguida de una hospitalización en otro hospital (229). Lo que más pesa es otra causa: en 1.252 de los casos agregados, el ingreso separado es programado, un parto o una sesión de tratamiento, que nunca cuentan como reingreso no planificado (</w:t>
+            </w:r>
+            <w:hyperlink w:history="1" w:anchor="E_D20">
+              <w:r>
+                <w:rPr>
+                  <w:color w:val="0563C1"/>
+                  <w:sz w:val="20"/>
+                  <w:szCs w:val="20"/>
+                  <w:u w:val="single"/>
+                </w:rPr>
+                <w:t xml:space="preserve">D20</w:t>
+              </w:r>
+            </w:hyperlink>
+            <w:r>
+              <w:rPr>
+                <w:sz w:val="20"/>
+                <w:szCs w:val="20"/>
+              </w:rPr>
+              <w:t xml:space="preserve"> y </w:t>
+            </w:r>
+            <w:hyperlink w:history="1" w:anchor="E_D33">
+              <w:r>
+                <w:rPr>
+                  <w:color w:val="0563C1"/>
+                  <w:sz w:val="20"/>
+                  <w:szCs w:val="20"/>
+                  <w:u w:val="single"/>
+                </w:rPr>
+                <w:t xml:space="preserve">D33</w:t>
+              </w:r>
+            </w:hyperlink>
+            <w:r>
+              <w:rPr>
+                <w:sz w:val="20"/>
+                <w:szCs w:val="20"/>
+              </w:rPr>
+              <w:t xml:space="preserve">). Por ejemplo, una mujer que pasa a otro hospital para el parto el mismo día o al día siguiente: con la marca exigida, su alta anterior se vuelve caso de estudio, pero el parto no es un reingreso.</w:t>
+            </w:r>
+          </w:p>
+        </w:tc>
+      </w:tr>
+      <w:tr>
+        <w:trPr>
+          <w:cantSplit/>
+        </w:trPr>
+        <w:tc>
+          <w:tcPr>
+            <w:tcW w:type="dxa" w:w="1800"/>
+            <w:shd w:fill="F2F2F2" w:color="auto" w:val="clear"/>
+            <w:tcMar>
+              <w:top w:type="dxa" w:w="70"/>
+              <w:left w:type="dxa" w:w="100"/>
+              <w:bottom w:type="dxa" w:w="70"/>
+              <w:right w:type="dxa" w:w="100"/>
+            </w:tcMar>
+          </w:tcPr>
+          <w:p>
+            <w:pPr>
+              <w:keepNext/>
+              <w:spacing w:after="0"/>
+            </w:pPr>
+            <w:r>
+              <w:rPr>
+                <w:b/>
+                <w:bCs/>
+                <w:color w:val="404040"/>
+                <w:sz w:val="20"/>
+                <w:szCs w:val="20"/>
+              </w:rPr>
+              <w:t xml:space="preserve">Los 75 casos comunes de H27</w:t>
+            </w:r>
+          </w:p>
+        </w:tc>
+        <w:tc>
+          <w:tcPr>
+            <w:tcW w:type="dxa" w:w="7226"/>
+            <w:tcMar>
+              <w:top w:type="dxa" w:w="70"/>
+              <w:left w:type="dxa" w:w="100"/>
+              <w:bottom w:type="dxa" w:w="70"/>
+              <w:right w:type="dxa" w:w="100"/>
+            </w:tcMar>
+          </w:tcPr>
+          <w:p>
+            <w:pPr>
+              <w:keepNext/>
+              <w:spacing w:after="0" w:before="0"/>
+            </w:pPr>
+            <w:r>
+              <w:rPr>
+                <w:sz w:val="20"/>
+                <w:szCs w:val="20"/>
+              </w:rPr>
+              <w:t xml:space="preserve">Son los que ganan un reingreso en alguna variable (9 en </w:t>
+            </w:r>
+            <w:r>
+              <w:rPr>
+                <w:rFonts w:ascii="Consolas" w:cs="Consolas" w:eastAsia="Consolas" w:hAnsi="Consolas"/>
+                <w:sz w:val="18"/>
+                <w:szCs w:val="18"/>
+                <w:shd w:fill="F2F2F2" w:color="auto" w:val="clear"/>
+              </w:rPr>
+              <w:t xml:space="preserve">REING_7D</w:t>
+            </w:r>
+            <w:r>
+              <w:rPr>
+                <w:sz w:val="20"/>
+                <w:szCs w:val="20"/>
+              </w:rPr>
+              <w:t xml:space="preserve">, 5 en </w:t>
+            </w:r>
+            <w:r>
+              <w:rPr>
+                <w:rFonts w:ascii="Consolas" w:cs="Consolas" w:eastAsia="Consolas" w:hAnsi="Consolas"/>
+                <w:sz w:val="18"/>
+                <w:szCs w:val="18"/>
+                <w:shd w:fill="F2F2F2" w:color="auto" w:val="clear"/>
+              </w:rPr>
+              <w:t xml:space="preserve">REING_7D_CDM</w:t>
+            </w:r>
+            <w:r>
+              <w:rPr>
+                <w:sz w:val="20"/>
+                <w:szCs w:val="20"/>
+              </w:rPr>
+              <w:t xml:space="preserve">, 49 en </w:t>
+            </w:r>
+            <w:r>
+              <w:rPr>
+                <w:rFonts w:ascii="Consolas" w:cs="Consolas" w:eastAsia="Consolas" w:hAnsi="Consolas"/>
+                <w:sz w:val="18"/>
+                <w:szCs w:val="18"/>
+                <w:shd w:fill="F2F2F2" w:color="auto" w:val="clear"/>
+              </w:rPr>
+              <w:t xml:space="preserve">REING_30D</w:t>
+            </w:r>
+            <w:r>
+              <w:rPr>
+                <w:sz w:val="20"/>
+                <w:szCs w:val="20"/>
+              </w:rPr>
+              <w:t xml:space="preserve"> y 50 en </w:t>
+            </w:r>
+            <w:r>
+              <w:rPr>
+                <w:rFonts w:ascii="Consolas" w:cs="Consolas" w:eastAsia="Consolas" w:hAnsi="Consolas"/>
+                <w:sz w:val="18"/>
+                <w:szCs w:val="18"/>
+                <w:shd w:fill="F2F2F2" w:color="auto" w:val="clear"/>
+              </w:rPr>
+              <w:t xml:space="preserve">REING_30D_CDM</w:t>
+            </w:r>
+            <w:r>
+              <w:rPr>
+                <w:sz w:val="20"/>
+                <w:szCs w:val="20"/>
+              </w:rPr>
+              <w:t xml:space="preserve">), porque el ingreso separado cae en su ventana y antes, como continuación de un traslado, no contaba. Ninguno pierde un reingreso.</w:t>
+            </w:r>
+          </w:p>
+        </w:tc>
+      </w:tr>
+      <w:tr>
+        <w:trPr>
+          <w:cantSplit/>
+        </w:trPr>
+        <w:tc>
+          <w:tcPr>
+            <w:tcW w:type="dxa" w:w="1800"/>
+            <w:shd w:fill="F2F2F2" w:color="auto" w:val="clear"/>
+            <w:tcMar>
+              <w:top w:type="dxa" w:w="70"/>
+              <w:left w:type="dxa" w:w="100"/>
+              <w:bottom w:type="dxa" w:w="70"/>
+              <w:right w:type="dxa" w:w="100"/>
+            </w:tcMar>
+          </w:tcPr>
+          <w:p>
+            <w:pPr>
+              <w:keepNext/>
+              <w:spacing w:after="0"/>
+            </w:pPr>
+            <w:r>
+              <w:rPr>
+                <w:b/>
+                <w:bCs/>
+                <w:color w:val="404040"/>
+                <w:sz w:val="20"/>
+                <w:szCs w:val="20"/>
+              </w:rPr>
+              <w:t xml:space="preserve">Conclusión</w:t>
+            </w:r>
+          </w:p>
+        </w:tc>
+        <w:tc>
+          <w:tcPr>
+            <w:tcW w:type="dxa" w:w="7226"/>
+            <w:tcMar>
+              <w:top w:type="dxa" w:w="70"/>
+              <w:left w:type="dxa" w:w="100"/>
+              <w:bottom w:type="dxa" w:w="70"/>
+              <w:right w:type="dxa" w:w="100"/>
+            </w:tcMar>
+          </w:tcPr>
+          <w:p>
+            <w:pPr>
+              <w:keepNext/>
+              <w:spacing w:after="0" w:before="0"/>
+            </w:pPr>
+            <w:r>
+              <w:rPr>
+                <w:sz w:val="20"/>
+                <w:szCs w:val="20"/>
+              </w:rPr>
+              <w:t xml:space="preserve">El efecto de exigir la marca sigue siendo pequeño (2,5 % más casos con </w:t>
+            </w:r>
+            <w:r>
+              <w:rPr>
+                <w:rFonts w:ascii="Consolas" w:cs="Consolas" w:eastAsia="Consolas" w:hAnsi="Consolas"/>
+                <w:sz w:val="18"/>
+                <w:szCs w:val="18"/>
+                <w:shd w:fill="F2F2F2" w:color="auto" w:val="clear"/>
+              </w:rPr>
+              <w:t xml:space="preserve">REING_7D</w:t>
+            </w:r>
+            <w:r>
+              <w:rPr>
+                <w:sz w:val="20"/>
+                <w:szCs w:val="20"/>
+              </w:rPr>
+              <w:t xml:space="preserve">) y está explicado caso por caso. Se mantiene la regla </w:t>
+            </w:r>
+            <w:hyperlink w:history="1" w:anchor="E_D19">
+              <w:r>
+                <w:rPr>
+                  <w:color w:val="0563C1"/>
+                  <w:sz w:val="20"/>
+                  <w:szCs w:val="20"/>
+                  <w:u w:val="single"/>
+                </w:rPr>
+                <w:t xml:space="preserve">D19</w:t>
+              </w:r>
+            </w:hyperlink>
+            <w:r>
+              <w:rPr>
+                <w:sz w:val="20"/>
+                <w:szCs w:val="20"/>
+              </w:rPr>
+              <w:t xml:space="preserve">.</w:t>
+            </w:r>
+          </w:p>
+        </w:tc>
+      </w:tr>
+      <w:tr>
+        <w:trPr>
+          <w:cantSplit/>
+        </w:trPr>
+        <w:tc>
+          <w:tcPr>
+            <w:tcW w:type="dxa" w:w="1800"/>
+            <w:shd w:fill="F2F2F2" w:color="auto" w:val="clear"/>
+            <w:tcMar>
+              <w:top w:type="dxa" w:w="70"/>
+              <w:left w:type="dxa" w:w="100"/>
+              <w:bottom w:type="dxa" w:w="70"/>
+              <w:right w:type="dxa" w:w="100"/>
+            </w:tcMar>
+          </w:tcPr>
+          <w:p>
+            <w:pPr>
+              <w:keepNext/>
+              <w:spacing w:after="0"/>
+            </w:pPr>
+            <w:r>
+              <w:rPr>
+                <w:b/>
+                <w:bCs/>
+                <w:color w:val="404040"/>
+                <w:sz w:val="20"/>
+                <w:szCs w:val="20"/>
+              </w:rPr>
+              <w:t xml:space="preserve">Completa a</w:t>
+            </w:r>
+          </w:p>
+        </w:tc>
+        <w:tc>
+          <w:tcPr>
+            <w:tcW w:type="dxa" w:w="7226"/>
+            <w:tcMar>
+              <w:top w:type="dxa" w:w="70"/>
+              <w:left w:type="dxa" w:w="100"/>
+              <w:bottom w:type="dxa" w:w="70"/>
+              <w:right w:type="dxa" w:w="100"/>
+            </w:tcMar>
+          </w:tcPr>
+          <w:p>
+            <w:pPr>
+              <w:keepNext/>
+              <w:spacing w:after="0" w:before="0"/>
+            </w:pPr>
+            <w:hyperlink w:history="1" w:anchor="E_H27">
+              <w:r>
+                <w:rPr>
+                  <w:color w:val="0563C1"/>
+                  <w:sz w:val="20"/>
+                  <w:szCs w:val="20"/>
+                  <w:u w:val="single"/>
+                </w:rPr>
+                <w:t xml:space="preserve">H27</w:t>
+              </w:r>
+            </w:hyperlink>
+            <w:r>
+              <w:rPr>
+                <w:sz w:val="20"/>
+                <w:szCs w:val="20"/>
+              </w:rPr>
+              <w:t xml:space="preserve">.</w:t>
+            </w:r>
+          </w:p>
+        </w:tc>
+      </w:tr>
+      <w:tr>
+        <w:trPr>
+          <w:cantSplit/>
+        </w:trPr>
+        <w:tc>
+          <w:tcPr>
+            <w:tcW w:type="dxa" w:w="1800"/>
+            <w:shd w:fill="F2F2F2" w:color="auto" w:val="clear"/>
+            <w:tcMar>
+              <w:top w:type="dxa" w:w="70"/>
+              <w:left w:type="dxa" w:w="100"/>
+              <w:bottom w:type="dxa" w:w="70"/>
+              <w:right w:type="dxa" w:w="100"/>
+            </w:tcMar>
+          </w:tcPr>
+          <w:p>
+            <w:pPr>
+              <w:keepNext w:val="false"/>
+              <w:spacing w:after="0"/>
+            </w:pPr>
+            <w:r>
+              <w:rPr>
+                <w:b/>
+                <w:bCs/>
+                <w:color w:val="404040"/>
+                <w:sz w:val="20"/>
+                <w:szCs w:val="20"/>
+              </w:rPr>
+              <w:t xml:space="preserve">Evidencia</w:t>
+            </w:r>
+          </w:p>
+        </w:tc>
+        <w:tc>
+          <w:tcPr>
+            <w:tcW w:type="dxa" w:w="7226"/>
+            <w:tcMar>
+              <w:top w:type="dxa" w:w="70"/>
+              <w:left w:type="dxa" w:w="100"/>
+              <w:bottom w:type="dxa" w:w="70"/>
+              <w:right w:type="dxa" w:w="100"/>
+            </w:tcMar>
+          </w:tcPr>
+          <w:p>
+            <w:pPr>
+              <w:keepNext w:val="false"/>
+              <w:spacing w:after="0" w:before="0"/>
+            </w:pPr>
+            <w:r>
+              <w:rPr>
+                <w:rFonts w:ascii="Consolas" w:cs="Consolas" w:eastAsia="Consolas" w:hAnsi="Consolas"/>
+                <w:sz w:val="18"/>
+                <w:szCs w:val="18"/>
+                <w:shd w:fill="F2F2F2" w:color="auto" w:val="clear"/>
+              </w:rPr>
+              <w:t xml:space="preserve">2.2_depuracion_etiquetado/scripts/11_sensibilidad.py</w:t>
+            </w:r>
+            <w:r>
+              <w:rPr>
+                <w:sz w:val="20"/>
+                <w:szCs w:val="20"/>
+              </w:rPr>
+              <w:t xml:space="preserve"> → </w:t>
+            </w:r>
+            <w:r>
+              <w:rPr>
+                <w:rFonts w:ascii="Consolas" w:cs="Consolas" w:eastAsia="Consolas" w:hAnsi="Consolas"/>
+                <w:sz w:val="18"/>
+                <w:szCs w:val="18"/>
+                <w:shd w:fill="F2F2F2" w:color="auto" w:val="clear"/>
+              </w:rPr>
+              <w:t xml:space="preserve">2.2_depuracion_etiquetado/reportes/11_sensibilidad.md</w:t>
+            </w:r>
+            <w:r>
+              <w:rPr>
+                <w:sz w:val="20"/>
+                <w:szCs w:val="20"/>
+              </w:rPr>
+              <w:t xml:space="preserve">, sección 8 («Por qué los casos con </w:t>
+            </w:r>
+            <w:r>
+              <w:rPr>
+                <w:rFonts w:ascii="Consolas" w:cs="Consolas" w:eastAsia="Consolas" w:hAnsi="Consolas"/>
+                <w:sz w:val="18"/>
+                <w:szCs w:val="18"/>
+                <w:shd w:fill="F2F2F2" w:color="auto" w:val="clear"/>
+              </w:rPr>
+              <w:t xml:space="preserve">REING_7D</w:t>
+            </w:r>
+            <w:r>
+              <w:rPr>
+                <w:sz w:val="20"/>
+                <w:szCs w:val="20"/>
+              </w:rPr>
+              <w:t xml:space="preserve"> no aumentan tanto como los ingresos que dejan de unirse»), con el desglose en las cuatro variables; contraste independiente en </w:t>
+            </w:r>
+            <w:r>
+              <w:rPr>
+                <w:rFonts w:ascii="Consolas" w:cs="Consolas" w:eastAsia="Consolas" w:hAnsi="Consolas"/>
+                <w:sz w:val="18"/>
+                <w:szCs w:val="18"/>
+                <w:shd w:fill="F2F2F2" w:color="auto" w:val="clear"/>
+              </w:rPr>
+              <w:t xml:space="preserve">pruebas/verificar_11_sensibilidad.py</w:t>
+            </w:r>
+            <w:r>
+              <w:rPr>
+                <w:sz w:val="20"/>
+                <w:szCs w:val="20"/>
+              </w:rPr>
+              <w:t xml:space="preserve">.</w:t>
             </w:r>
           </w:p>
         </w:tc>
@@ -33665,6 +36011,72 @@
         <w:pStyle w:val="Heading1"/>
       </w:pPr>
       <w:r>
+        <w:t xml:space="preserve">Verificación de la ejecución del 26 de octubre de 2026</w:t>
+      </w:r>
+    </w:p>
+    <w:p>
+      <w:r>
+        <w:t xml:space="preserve">El script 11 se modificó para responder a las observaciones O3 y O4 de la revisión del 24 de octubre (</w:t>
+      </w:r>
+      <w:hyperlink w:history="1" w:anchor="E_H29">
+        <w:r>
+          <w:rPr>
+            <w:color w:val="0563C1"/>
+            <w:u w:val="single"/>
+          </w:rPr>
+          <w:t xml:space="preserve">H29</w:t>
+        </w:r>
+      </w:hyperlink>
+      <w:r>
+        <w:t xml:space="preserve"> y </w:t>
+      </w:r>
+      <w:hyperlink w:history="1" w:anchor="E_D39">
+        <w:r>
+          <w:rPr>
+            <w:color w:val="0563C1"/>
+            <w:u w:val="single"/>
+          </w:rPr>
+          <w:t xml:space="preserve">D39</w:t>
+        </w:r>
+      </w:hyperlink>
+      <w:r>
+        <w:t xml:space="preserve">) y se volvió a ejecutar con el reporte en una carpeta temporal, sin fallas en sus siete verificaciones (cuatro nuevas, que comprueban que cada desglose suma exactamente lo que explica). El reporte nuevo se comparó con el anterior: solo se agregaron las dos subsecciones y las verificaciones, y las tablas y tasas de los diez escenarios quedaron idénticas. Los scripts 08, 09 y 12 no se ejecutaron: los archivos de datos y la versión 2 del conjunto analítico no cambian.</w:t>
+      </w:r>
+    </w:p>
+    <w:p>
+      <w:r>
+        <w:t xml:space="preserve">Sobre la versión 2 se cumplen las 77 comprobaciones de los contrastes independientes (</w:t>
+      </w:r>
+      <w:r>
+        <w:rPr>
+          <w:rFonts w:ascii="Consolas" w:cs="Consolas" w:eastAsia="Consolas" w:hAnsi="Consolas"/>
+          <w:sz w:val="20"/>
+          <w:szCs w:val="20"/>
+          <w:shd w:fill="F2F2F2" w:color="auto" w:val="clear"/>
+        </w:rPr>
+        <w:t xml:space="preserve">reportes/pruebas_independientes.md</w:t>
+      </w:r>
+      <w:r>
+        <w:t xml:space="preserve">): depuración (43), etiquetado (20) y análisis de sensibilidad (14). Las tres nuevas recalculan por otro camino los ingresos que separa el escenario de traslados, el criterio que deja fuera a cada alta anterior, el aumento de casos con </w:t>
+      </w:r>
+      <w:r>
+        <w:rPr>
+          <w:rFonts w:ascii="Consolas" w:cs="Consolas" w:eastAsia="Consolas" w:hAnsi="Consolas"/>
+          <w:sz w:val="20"/>
+          <w:szCs w:val="20"/>
+          <w:shd w:fill="F2F2F2" w:color="auto" w:val="clear"/>
+        </w:rPr>
+        <w:t xml:space="preserve">REING_7D</w:t>
+      </w:r>
+      <w:r>
+        <w:t xml:space="preserve">, y el criterio posterior que deja fuera a cada derivado no agregado, y los comparan con las tablas del reporte 11.</w:t>
+      </w:r>
+    </w:p>
+    <w:p>
+      <w:pPr>
+        <w:pStyle w:val="Heading1"/>
+      </w:pPr>
+      <w:r>
         <w:t xml:space="preserve">Pendientes</w:t>
       </w:r>
     </w:p>
@@ -33941,7 +36353,7 @@
         <w:pStyle w:val="ListParagraph"/>
         <w:numPr>
           <w:ilvl w:val="0"/>
-          <w:numId w:val="4"/>
+          <w:numId w:val="3"/>
         </w:numPr>
         <w:spacing w:after="80"/>
       </w:pPr>
@@ -33995,6 +36407,116 @@
       </w:hyperlink>
       <w:r>
         <w:t xml:space="preserve"> y </w:t>
+      </w:r>
+      <w:hyperlink w:history="1" w:anchor="E_D39">
+        <w:r>
+          <w:rPr>
+            <w:color w:val="0563C1"/>
+            <w:u w:val="single"/>
+          </w:rPr>
+          <w:t xml:space="preserve">D39</w:t>
+        </w:r>
+      </w:hyperlink>
+      <w:r>
+        <w:t xml:space="preserve">. Los revisó el 24 de octubre de 2026: aprobó </w:t>
+      </w:r>
+      <w:hyperlink w:history="1" w:anchor="E_D38">
+        <w:r>
+          <w:rPr>
+            <w:color w:val="0563C1"/>
+            <w:u w:val="single"/>
+          </w:rPr>
+          <w:t xml:space="preserve">D38</w:t>
+        </w:r>
+      </w:hyperlink>
+      <w:r>
+        <w:t xml:space="preserve"> y </w:t>
+      </w:r>
+      <w:hyperlink w:history="1" w:anchor="E_D39">
+        <w:r>
+          <w:rPr>
+            <w:color w:val="0563C1"/>
+            <w:u w:val="single"/>
+          </w:rPr>
+          <w:t xml:space="preserve">D39</w:t>
+        </w:r>
+      </w:hyperlink>
+      <w:r>
+        <w:t xml:space="preserve"> y pidió explicar dos cifras de la sensibilidad (observaciones O3 y O4).</w:t>
+      </w:r>
+    </w:p>
+    <w:p>
+      <w:pPr>
+        <w:pStyle w:val="ListParagraph"/>
+        <w:numPr>
+          <w:ilvl w:val="0"/>
+          <w:numId w:val="3"/>
+        </w:numPr>
+        <w:spacing w:after="80"/>
+      </w:pPr>
+      <w:r>
+        <w:t xml:space="preserve">Explicar las dos cifras de la revisión del 24 de octubre: el aumento de casos con </w:t>
+      </w:r>
+      <w:r>
+        <w:rPr>
+          <w:rFonts w:ascii="Consolas" w:cs="Consolas" w:eastAsia="Consolas" w:hAnsi="Consolas"/>
+          <w:sz w:val="20"/>
+          <w:szCs w:val="20"/>
+          <w:shd w:fill="F2F2F2" w:color="auto" w:val="clear"/>
+        </w:rPr>
+        <w:t xml:space="preserve">REING_7D</w:t>
+      </w:r>
+      <w:r>
+        <w:t xml:space="preserve"> al exigir la marca de traslado (O3, </w:t>
+      </w:r>
+      <w:hyperlink w:history="1" w:anchor="E_H29">
+        <w:r>
+          <w:rPr>
+            <w:color w:val="0563C1"/>
+            <w:u w:val="single"/>
+          </w:rPr>
+          <w:t xml:space="preserve">H29</w:t>
+        </w:r>
+      </w:hyperlink>
+      <w:r>
+        <w:t xml:space="preserve"> y reporte 11, sección 8) y los derivados que la fila de sensibilidad no agrega (O4, </w:t>
+      </w:r>
+      <w:hyperlink w:history="1" w:anchor="E_D39">
+        <w:r>
+          <w:rPr>
+            <w:color w:val="0563C1"/>
+            <w:u w:val="single"/>
+          </w:rPr>
+          <w:t xml:space="preserve">D39</w:t>
+        </w:r>
+      </w:hyperlink>
+      <w:r>
+        <w:t xml:space="preserve"> y reporte 11, sección 9). Hecho el 26 de octubre de 2026.</w:t>
+      </w:r>
+    </w:p>
+    <w:p>
+      <w:pPr>
+        <w:pStyle w:val="ListParagraph"/>
+        <w:numPr>
+          <w:ilvl w:val="0"/>
+          <w:numId w:val="4"/>
+        </w:numPr>
+        <w:spacing w:after="80"/>
+      </w:pPr>
+      <w:r>
+        <w:t xml:space="preserve">Presentar al profesor guía, en el próximo avance, </w:t>
+      </w:r>
+      <w:hyperlink w:history="1" w:anchor="E_H29">
+        <w:r>
+          <w:rPr>
+            <w:color w:val="0563C1"/>
+            <w:u w:val="single"/>
+          </w:rPr>
+          <w:t xml:space="preserve">H29</w:t>
+        </w:r>
+      </w:hyperlink>
+      <w:r>
+        <w:t xml:space="preserve"> y el agregado a </w:t>
       </w:r>
       <w:hyperlink w:history="1" w:anchor="E_D39">
         <w:r>

</xml_diff>